<commit_message>
Conducteur Word : coquille corrigee et sommaire a jour
</commit_message>
<xml_diff>
--- a/documentation/Conducteur_Atelier_Agent_IA_2h.docx
+++ b/documentation/Conducteur_Atelier_Agent_IA_2h.docx
@@ -327,7 +327,7 @@
         <w:lastRenderedPageBreak/>
         <w:t xml:space="preserve"> </w:t>
       </w:r>
-      <w:bookmarkStart w:id="0" w:name="_Toc244424144"/>
+      <w:bookmarkStart w:id="0" w:name="_Toc244424264"/>
       <w:r>
         <w:rPr>
           <w:rFonts w:ascii="Calibri" w:hAnsi="Calibri"/>
@@ -620,7 +620,7 @@
           <w:bottom w:val="single" w:sz="8" w:space="3" w:color="DBEAFE"/>
         </w:pBdr>
       </w:pPr>
-      <w:bookmarkStart w:id="1" w:name="_Toc244424145"/>
+      <w:bookmarkStart w:id="1" w:name="_Toc244424265"/>
       <w:r>
         <w:rPr>
           <w:rFonts w:ascii="Calibri" w:hAnsi="Calibri"/>
@@ -764,7 +764,7 @@
           <w:bottom w:val="single" w:sz="8" w:space="3" w:color="DBEAFE"/>
         </w:pBdr>
       </w:pPr>
-      <w:bookmarkStart w:id="2" w:name="_Toc244424146"/>
+      <w:bookmarkStart w:id="2" w:name="_Toc244424266"/>
       <w:r>
         <w:rPr>
           <w:rFonts w:ascii="Calibri" w:hAnsi="Calibri"/>
@@ -1248,7 +1248,7 @@
           <w:bottom w:val="single" w:sz="8" w:space="3" w:color="DBEAFE"/>
         </w:pBdr>
       </w:pPr>
-      <w:bookmarkStart w:id="3" w:name="_Toc244424147"/>
+      <w:bookmarkStart w:id="3" w:name="_Toc244424267"/>
       <w:r>
         <w:rPr>
           <w:rFonts w:ascii="Calibri" w:hAnsi="Calibri"/>
@@ -1339,7 +1339,7 @@
       <w:r>
         <w:fldChar w:fldCharType="separate"/>
       </w:r>
-      <w:hyperlink w:anchor="_Toc244424144" w:history="1">
+      <w:hyperlink w:anchor="_Toc244424264" w:history="1">
         <w:r>
           <w:rPr>
             <w:rStyle w:val="Hyperlink"/>
@@ -1366,7 +1366,7 @@
             <w:noProof/>
             <w:webHidden/>
           </w:rPr>
-          <w:instrText xml:space="preserve"> PAGEREF _Toc244424144 \h </w:instrText>
+          <w:instrText xml:space="preserve"> PAGEREF _Toc244424264 \h </w:instrText>
         </w:r>
         <w:r>
           <w:rPr>
@@ -1414,7 +1414,7 @@
           <w14:ligatures w14:val="standardContextual"/>
         </w:rPr>
       </w:pPr>
-      <w:hyperlink w:anchor="_Toc244424145" w:history="1">
+      <w:hyperlink w:anchor="_Toc244424265" w:history="1">
         <w:r>
           <w:rPr>
             <w:rStyle w:val="Hyperlink"/>
@@ -1441,7 +1441,7 @@
             <w:noProof/>
             <w:webHidden/>
           </w:rPr>
-          <w:instrText xml:space="preserve"> PAGEREF _Toc244424145 \h </w:instrText>
+          <w:instrText xml:space="preserve"> PAGEREF _Toc244424265 \h </w:instrText>
         </w:r>
         <w:r>
           <w:rPr>
@@ -1489,7 +1489,7 @@
           <w14:ligatures w14:val="standardContextual"/>
         </w:rPr>
       </w:pPr>
-      <w:hyperlink w:anchor="_Toc244424146" w:history="1">
+      <w:hyperlink w:anchor="_Toc244424266" w:history="1">
         <w:r>
           <w:rPr>
             <w:rStyle w:val="Hyperlink"/>
@@ -1516,7 +1516,7 @@
             <w:noProof/>
             <w:webHidden/>
           </w:rPr>
-          <w:instrText xml:space="preserve"> PAGEREF _Toc244424146 \h </w:instrText>
+          <w:instrText xml:space="preserve"> PAGEREF _Toc244424266 \h </w:instrText>
         </w:r>
         <w:r>
           <w:rPr>
@@ -1564,7 +1564,7 @@
           <w14:ligatures w14:val="standardContextual"/>
         </w:rPr>
       </w:pPr>
-      <w:hyperlink w:anchor="_Toc244424147" w:history="1">
+      <w:hyperlink w:anchor="_Toc244424267" w:history="1">
         <w:r>
           <w:rPr>
             <w:rStyle w:val="Hyperlink"/>
@@ -1591,7 +1591,7 @@
             <w:noProof/>
             <w:webHidden/>
           </w:rPr>
-          <w:instrText xml:space="preserve"> PAGEREF _Toc244424147 \h </w:instrText>
+          <w:instrText xml:space="preserve"> PAGEREF _Toc244424267 \h </w:instrText>
         </w:r>
         <w:r>
           <w:rPr>
@@ -1639,7 +1639,7 @@
           <w14:ligatures w14:val="standardContextual"/>
         </w:rPr>
       </w:pPr>
-      <w:hyperlink w:anchor="_Toc244424148" w:history="1">
+      <w:hyperlink w:anchor="_Toc244424268" w:history="1">
         <w:r>
           <w:rPr>
             <w:rStyle w:val="Hyperlink"/>
@@ -1666,7 +1666,7 @@
             <w:noProof/>
             <w:webHidden/>
           </w:rPr>
-          <w:instrText xml:space="preserve"> PAGEREF _Toc244424148 \h </w:instrText>
+          <w:instrText xml:space="preserve"> PAGEREF _Toc244424268 \h </w:instrText>
         </w:r>
         <w:r>
           <w:rPr>
@@ -1714,7 +1714,7 @@
           <w14:ligatures w14:val="standardContextual"/>
         </w:rPr>
       </w:pPr>
-      <w:hyperlink w:anchor="_Toc244424149" w:history="1">
+      <w:hyperlink w:anchor="_Toc244424269" w:history="1">
         <w:r>
           <w:rPr>
             <w:rStyle w:val="Hyperlink"/>
@@ -1741,7 +1741,7 @@
             <w:noProof/>
             <w:webHidden/>
           </w:rPr>
-          <w:instrText xml:space="preserve"> PAGEREF _Toc244424149 \h </w:instrText>
+          <w:instrText xml:space="preserve"> PAGEREF _Toc244424269 \h </w:instrText>
         </w:r>
         <w:r>
           <w:rPr>
@@ -1789,7 +1789,7 @@
           <w14:ligatures w14:val="standardContextual"/>
         </w:rPr>
       </w:pPr>
-      <w:hyperlink w:anchor="_Toc244424150" w:history="1">
+      <w:hyperlink w:anchor="_Toc244424270" w:history="1">
         <w:r>
           <w:rPr>
             <w:rStyle w:val="Hyperlink"/>
@@ -1816,7 +1816,7 @@
             <w:noProof/>
             <w:webHidden/>
           </w:rPr>
-          <w:instrText xml:space="preserve"> PAGEREF _Toc244424150 \h </w:instrText>
+          <w:instrText xml:space="preserve"> PAGEREF _Toc244424270 \h </w:instrText>
         </w:r>
         <w:r>
           <w:rPr>
@@ -1864,7 +1864,7 @@
           <w14:ligatures w14:val="standardContextual"/>
         </w:rPr>
       </w:pPr>
-      <w:hyperlink w:anchor="_Toc244424151" w:history="1">
+      <w:hyperlink w:anchor="_Toc244424271" w:history="1">
         <w:r>
           <w:rPr>
             <w:rStyle w:val="Hyperlink"/>
@@ -1891,7 +1891,7 @@
             <w:noProof/>
             <w:webHidden/>
           </w:rPr>
-          <w:instrText xml:space="preserve"> PAGEREF _Toc244424151 \h </w:instrText>
+          <w:instrText xml:space="preserve"> PAGEREF _Toc244424271 \h </w:instrText>
         </w:r>
         <w:r>
           <w:rPr>
@@ -1939,7 +1939,7 @@
           <w14:ligatures w14:val="standardContextual"/>
         </w:rPr>
       </w:pPr>
-      <w:hyperlink w:anchor="_Toc244424152" w:history="1">
+      <w:hyperlink w:anchor="_Toc244424272" w:history="1">
         <w:r>
           <w:rPr>
             <w:rStyle w:val="Hyperlink"/>
@@ -1966,7 +1966,7 @@
             <w:noProof/>
             <w:webHidden/>
           </w:rPr>
-          <w:instrText xml:space="preserve"> PAGEREF _Toc244424152 \h </w:instrText>
+          <w:instrText xml:space="preserve"> PAGEREF _Toc244424272 \h </w:instrText>
         </w:r>
         <w:r>
           <w:rPr>
@@ -2014,7 +2014,7 @@
           <w14:ligatures w14:val="standardContextual"/>
         </w:rPr>
       </w:pPr>
-      <w:hyperlink w:anchor="_Toc244424153" w:history="1">
+      <w:hyperlink w:anchor="_Toc244424273" w:history="1">
         <w:r>
           <w:rPr>
             <w:rStyle w:val="Hyperlink"/>
@@ -2041,7 +2041,7 @@
             <w:noProof/>
             <w:webHidden/>
           </w:rPr>
-          <w:instrText xml:space="preserve"> PAGEREF _Toc244424153 \h </w:instrText>
+          <w:instrText xml:space="preserve"> PAGEREF _Toc244424273 \h </w:instrText>
         </w:r>
         <w:r>
           <w:rPr>
@@ -2089,7 +2089,7 @@
           <w14:ligatures w14:val="standardContextual"/>
         </w:rPr>
       </w:pPr>
-      <w:hyperlink w:anchor="_Toc244424154" w:history="1">
+      <w:hyperlink w:anchor="_Toc244424274" w:history="1">
         <w:r>
           <w:rPr>
             <w:rStyle w:val="Hyperlink"/>
@@ -2116,7 +2116,7 @@
             <w:noProof/>
             <w:webHidden/>
           </w:rPr>
-          <w:instrText xml:space="preserve"> PAGEREF _Toc244424154 \h </w:instrText>
+          <w:instrText xml:space="preserve"> PAGEREF _Toc244424274 \h </w:instrText>
         </w:r>
         <w:r>
           <w:rPr>
@@ -2164,7 +2164,7 @@
           <w14:ligatures w14:val="standardContextual"/>
         </w:rPr>
       </w:pPr>
-      <w:hyperlink w:anchor="_Toc244424155" w:history="1">
+      <w:hyperlink w:anchor="_Toc244424275" w:history="1">
         <w:r>
           <w:rPr>
             <w:rStyle w:val="Hyperlink"/>
@@ -2191,7 +2191,7 @@
             <w:noProof/>
             <w:webHidden/>
           </w:rPr>
-          <w:instrText xml:space="preserve"> PAGEREF _Toc244424155 \h </w:instrText>
+          <w:instrText xml:space="preserve"> PAGEREF _Toc244424275 \h </w:instrText>
         </w:r>
         <w:r>
           <w:rPr>
@@ -2239,7 +2239,7 @@
           <w14:ligatures w14:val="standardContextual"/>
         </w:rPr>
       </w:pPr>
-      <w:hyperlink w:anchor="_Toc244424156" w:history="1">
+      <w:hyperlink w:anchor="_Toc244424276" w:history="1">
         <w:r>
           <w:rPr>
             <w:rStyle w:val="Hyperlink"/>
@@ -2266,7 +2266,7 @@
             <w:noProof/>
             <w:webHidden/>
           </w:rPr>
-          <w:instrText xml:space="preserve"> PAGEREF _Toc244424156 \h </w:instrText>
+          <w:instrText xml:space="preserve"> PAGEREF _Toc244424276 \h </w:instrText>
         </w:r>
         <w:r>
           <w:rPr>
@@ -2314,7 +2314,7 @@
           <w14:ligatures w14:val="standardContextual"/>
         </w:rPr>
       </w:pPr>
-      <w:hyperlink w:anchor="_Toc244424157" w:history="1">
+      <w:hyperlink w:anchor="_Toc244424277" w:history="1">
         <w:r>
           <w:rPr>
             <w:rStyle w:val="Hyperlink"/>
@@ -2341,7 +2341,7 @@
             <w:noProof/>
             <w:webHidden/>
           </w:rPr>
-          <w:instrText xml:space="preserve"> PAGEREF _Toc244424157 \h </w:instrText>
+          <w:instrText xml:space="preserve"> PAGEREF _Toc244424277 \h </w:instrText>
         </w:r>
         <w:r>
           <w:rPr>
@@ -2389,7 +2389,7 @@
           <w14:ligatures w14:val="standardContextual"/>
         </w:rPr>
       </w:pPr>
-      <w:hyperlink w:anchor="_Toc244424158" w:history="1">
+      <w:hyperlink w:anchor="_Toc244424278" w:history="1">
         <w:r>
           <w:rPr>
             <w:rStyle w:val="Hyperlink"/>
@@ -2416,7 +2416,7 @@
             <w:noProof/>
             <w:webHidden/>
           </w:rPr>
-          <w:instrText xml:space="preserve"> PAGEREF _Toc244424158 \h </w:instrText>
+          <w:instrText xml:space="preserve"> PAGEREF _Toc244424278 \h </w:instrText>
         </w:r>
         <w:r>
           <w:rPr>
@@ -2464,7 +2464,7 @@
           <w14:ligatures w14:val="standardContextual"/>
         </w:rPr>
       </w:pPr>
-      <w:hyperlink w:anchor="_Toc244424159" w:history="1">
+      <w:hyperlink w:anchor="_Toc244424279" w:history="1">
         <w:r>
           <w:rPr>
             <w:rStyle w:val="Hyperlink"/>
@@ -2491,7 +2491,7 @@
             <w:noProof/>
             <w:webHidden/>
           </w:rPr>
-          <w:instrText xml:space="preserve"> PAGEREF _Toc244424159 \h </w:instrText>
+          <w:instrText xml:space="preserve"> PAGEREF _Toc244424279 \h </w:instrText>
         </w:r>
         <w:r>
           <w:rPr>
@@ -2539,7 +2539,7 @@
           <w14:ligatures w14:val="standardContextual"/>
         </w:rPr>
       </w:pPr>
-      <w:hyperlink w:anchor="_Toc244424160" w:history="1">
+      <w:hyperlink w:anchor="_Toc244424280" w:history="1">
         <w:r>
           <w:rPr>
             <w:rStyle w:val="Hyperlink"/>
@@ -2566,7 +2566,7 @@
             <w:noProof/>
             <w:webHidden/>
           </w:rPr>
-          <w:instrText xml:space="preserve"> PAGEREF _Toc244424160 \h </w:instrText>
+          <w:instrText xml:space="preserve"> PAGEREF _Toc244424280 \h </w:instrText>
         </w:r>
         <w:r>
           <w:rPr>
@@ -2614,7 +2614,7 @@
           <w14:ligatures w14:val="standardContextual"/>
         </w:rPr>
       </w:pPr>
-      <w:hyperlink w:anchor="_Toc244424161" w:history="1">
+      <w:hyperlink w:anchor="_Toc244424281" w:history="1">
         <w:r>
           <w:rPr>
             <w:rStyle w:val="Hyperlink"/>
@@ -2641,7 +2641,7 @@
             <w:noProof/>
             <w:webHidden/>
           </w:rPr>
-          <w:instrText xml:space="preserve"> PAGEREF _Toc244424161 \h </w:instrText>
+          <w:instrText xml:space="preserve"> PAGEREF _Toc244424281 \h </w:instrText>
         </w:r>
         <w:r>
           <w:rPr>
@@ -2689,7 +2689,7 @@
           <w14:ligatures w14:val="standardContextual"/>
         </w:rPr>
       </w:pPr>
-      <w:hyperlink w:anchor="_Toc244424162" w:history="1">
+      <w:hyperlink w:anchor="_Toc244424282" w:history="1">
         <w:r>
           <w:rPr>
             <w:rStyle w:val="Hyperlink"/>
@@ -2716,7 +2716,7 @@
             <w:noProof/>
             <w:webHidden/>
           </w:rPr>
-          <w:instrText xml:space="preserve"> PAGEREF _Toc244424162 \h </w:instrText>
+          <w:instrText xml:space="preserve"> PAGEREF _Toc244424282 \h </w:instrText>
         </w:r>
         <w:r>
           <w:rPr>
@@ -2764,7 +2764,7 @@
           <w14:ligatures w14:val="standardContextual"/>
         </w:rPr>
       </w:pPr>
-      <w:hyperlink w:anchor="_Toc244424163" w:history="1">
+      <w:hyperlink w:anchor="_Toc244424283" w:history="1">
         <w:r>
           <w:rPr>
             <w:rStyle w:val="Hyperlink"/>
@@ -2791,7 +2791,7 @@
             <w:noProof/>
             <w:webHidden/>
           </w:rPr>
-          <w:instrText xml:space="preserve"> PAGEREF _Toc244424163 \h </w:instrText>
+          <w:instrText xml:space="preserve"> PAGEREF _Toc244424283 \h </w:instrText>
         </w:r>
         <w:r>
           <w:rPr>
@@ -2839,7 +2839,7 @@
           <w14:ligatures w14:val="standardContextual"/>
         </w:rPr>
       </w:pPr>
-      <w:hyperlink w:anchor="_Toc244424164" w:history="1">
+      <w:hyperlink w:anchor="_Toc244424284" w:history="1">
         <w:r>
           <w:rPr>
             <w:rStyle w:val="Hyperlink"/>
@@ -2866,7 +2866,7 @@
             <w:noProof/>
             <w:webHidden/>
           </w:rPr>
-          <w:instrText xml:space="preserve"> PAGEREF _Toc244424164 \h </w:instrText>
+          <w:instrText xml:space="preserve"> PAGEREF _Toc244424284 \h </w:instrText>
         </w:r>
         <w:r>
           <w:rPr>
@@ -2914,7 +2914,7 @@
           <w14:ligatures w14:val="standardContextual"/>
         </w:rPr>
       </w:pPr>
-      <w:hyperlink w:anchor="_Toc244424165" w:history="1">
+      <w:hyperlink w:anchor="_Toc244424285" w:history="1">
         <w:r>
           <w:rPr>
             <w:rStyle w:val="Hyperlink"/>
@@ -2941,7 +2941,7 @@
             <w:noProof/>
             <w:webHidden/>
           </w:rPr>
-          <w:instrText xml:space="preserve"> PAGEREF _Toc244424165 \h </w:instrText>
+          <w:instrText xml:space="preserve"> PAGEREF _Toc244424285 \h </w:instrText>
         </w:r>
         <w:r>
           <w:rPr>
@@ -2989,7 +2989,7 @@
           <w14:ligatures w14:val="standardContextual"/>
         </w:rPr>
       </w:pPr>
-      <w:hyperlink w:anchor="_Toc244424166" w:history="1">
+      <w:hyperlink w:anchor="_Toc244424286" w:history="1">
         <w:r>
           <w:rPr>
             <w:rStyle w:val="Hyperlink"/>
@@ -3016,7 +3016,7 @@
             <w:noProof/>
             <w:webHidden/>
           </w:rPr>
-          <w:instrText xml:space="preserve"> PAGEREF _Toc244424166 \h </w:instrText>
+          <w:instrText xml:space="preserve"> PAGEREF _Toc244424286 \h </w:instrText>
         </w:r>
         <w:r>
           <w:rPr>
@@ -3064,7 +3064,7 @@
           <w14:ligatures w14:val="standardContextual"/>
         </w:rPr>
       </w:pPr>
-      <w:hyperlink w:anchor="_Toc244424167" w:history="1">
+      <w:hyperlink w:anchor="_Toc244424287" w:history="1">
         <w:r>
           <w:rPr>
             <w:rStyle w:val="Hyperlink"/>
@@ -3091,7 +3091,7 @@
             <w:noProof/>
             <w:webHidden/>
           </w:rPr>
-          <w:instrText xml:space="preserve"> PAGEREF _Toc244424167 \h </w:instrText>
+          <w:instrText xml:space="preserve"> PAGEREF _Toc244424287 \h </w:instrText>
         </w:r>
         <w:r>
           <w:rPr>
@@ -3139,7 +3139,7 @@
           <w14:ligatures w14:val="standardContextual"/>
         </w:rPr>
       </w:pPr>
-      <w:hyperlink w:anchor="_Toc244424168" w:history="1">
+      <w:hyperlink w:anchor="_Toc244424288" w:history="1">
         <w:r>
           <w:rPr>
             <w:rStyle w:val="Hyperlink"/>
@@ -3166,7 +3166,7 @@
             <w:noProof/>
             <w:webHidden/>
           </w:rPr>
-          <w:instrText xml:space="preserve"> PAGEREF _Toc244424168 \h </w:instrText>
+          <w:instrText xml:space="preserve"> PAGEREF _Toc244424288 \h </w:instrText>
         </w:r>
         <w:r>
           <w:rPr>
@@ -3214,7 +3214,7 @@
           <w14:ligatures w14:val="standardContextual"/>
         </w:rPr>
       </w:pPr>
-      <w:hyperlink w:anchor="_Toc244424169" w:history="1">
+      <w:hyperlink w:anchor="_Toc244424289" w:history="1">
         <w:r>
           <w:rPr>
             <w:rStyle w:val="Hyperlink"/>
@@ -3241,7 +3241,7 @@
             <w:noProof/>
             <w:webHidden/>
           </w:rPr>
-          <w:instrText xml:space="preserve"> PAGEREF _Toc244424169 \h </w:instrText>
+          <w:instrText xml:space="preserve"> PAGEREF _Toc244424289 \h </w:instrText>
         </w:r>
         <w:r>
           <w:rPr>
@@ -3289,7 +3289,7 @@
           <w14:ligatures w14:val="standardContextual"/>
         </w:rPr>
       </w:pPr>
-      <w:hyperlink w:anchor="_Toc244424170" w:history="1">
+      <w:hyperlink w:anchor="_Toc244424290" w:history="1">
         <w:r>
           <w:rPr>
             <w:rStyle w:val="Hyperlink"/>
@@ -3316,7 +3316,7 @@
             <w:noProof/>
             <w:webHidden/>
           </w:rPr>
-          <w:instrText xml:space="preserve"> PAGEREF _Toc244424170 \h </w:instrText>
+          <w:instrText xml:space="preserve"> PAGEREF _Toc244424290 \h </w:instrText>
         </w:r>
         <w:r>
           <w:rPr>
@@ -3364,7 +3364,7 @@
           <w14:ligatures w14:val="standardContextual"/>
         </w:rPr>
       </w:pPr>
-      <w:hyperlink w:anchor="_Toc244424171" w:history="1">
+      <w:hyperlink w:anchor="_Toc244424291" w:history="1">
         <w:r>
           <w:rPr>
             <w:rStyle w:val="Hyperlink"/>
@@ -3391,7 +3391,7 @@
             <w:noProof/>
             <w:webHidden/>
           </w:rPr>
-          <w:instrText xml:space="preserve"> PAGEREF _Toc244424171 \h </w:instrText>
+          <w:instrText xml:space="preserve"> PAGEREF _Toc244424291 \h </w:instrText>
         </w:r>
         <w:r>
           <w:rPr>
@@ -3439,7 +3439,7 @@
           <w14:ligatures w14:val="standardContextual"/>
         </w:rPr>
       </w:pPr>
-      <w:hyperlink w:anchor="_Toc244424172" w:history="1">
+      <w:hyperlink w:anchor="_Toc244424292" w:history="1">
         <w:r>
           <w:rPr>
             <w:rStyle w:val="Hyperlink"/>
@@ -3466,7 +3466,7 @@
             <w:noProof/>
             <w:webHidden/>
           </w:rPr>
-          <w:instrText xml:space="preserve"> PAGEREF _Toc244424172 \h </w:instrText>
+          <w:instrText xml:space="preserve"> PAGEREF _Toc244424292 \h </w:instrText>
         </w:r>
         <w:r>
           <w:rPr>
@@ -3514,7 +3514,7 @@
           <w14:ligatures w14:val="standardContextual"/>
         </w:rPr>
       </w:pPr>
-      <w:hyperlink w:anchor="_Toc244424173" w:history="1">
+      <w:hyperlink w:anchor="_Toc244424293" w:history="1">
         <w:r>
           <w:rPr>
             <w:rStyle w:val="Hyperlink"/>
@@ -3541,7 +3541,7 @@
             <w:noProof/>
             <w:webHidden/>
           </w:rPr>
-          <w:instrText xml:space="preserve"> PAGEREF _Toc244424173 \h </w:instrText>
+          <w:instrText xml:space="preserve"> PAGEREF _Toc244424293 \h </w:instrText>
         </w:r>
         <w:r>
           <w:rPr>
@@ -3589,7 +3589,7 @@
           <w14:ligatures w14:val="standardContextual"/>
         </w:rPr>
       </w:pPr>
-      <w:hyperlink w:anchor="_Toc244424174" w:history="1">
+      <w:hyperlink w:anchor="_Toc244424294" w:history="1">
         <w:r>
           <w:rPr>
             <w:rStyle w:val="Hyperlink"/>
@@ -3616,7 +3616,7 @@
             <w:noProof/>
             <w:webHidden/>
           </w:rPr>
-          <w:instrText xml:space="preserve"> PAGEREF _Toc244424174 \h </w:instrText>
+          <w:instrText xml:space="preserve"> PAGEREF _Toc244424294 \h </w:instrText>
         </w:r>
         <w:r>
           <w:rPr>
@@ -3664,7 +3664,7 @@
           <w14:ligatures w14:val="standardContextual"/>
         </w:rPr>
       </w:pPr>
-      <w:hyperlink w:anchor="_Toc244424175" w:history="1">
+      <w:hyperlink w:anchor="_Toc244424295" w:history="1">
         <w:r>
           <w:rPr>
             <w:rStyle w:val="Hyperlink"/>
@@ -3691,7 +3691,7 @@
             <w:noProof/>
             <w:webHidden/>
           </w:rPr>
-          <w:instrText xml:space="preserve"> PAGEREF _Toc244424175 \h </w:instrText>
+          <w:instrText xml:space="preserve"> PAGEREF _Toc244424295 \h </w:instrText>
         </w:r>
         <w:r>
           <w:rPr>
@@ -3739,7 +3739,7 @@
           <w14:ligatures w14:val="standardContextual"/>
         </w:rPr>
       </w:pPr>
-      <w:hyperlink w:anchor="_Toc244424176" w:history="1">
+      <w:hyperlink w:anchor="_Toc244424296" w:history="1">
         <w:r>
           <w:rPr>
             <w:rStyle w:val="Hyperlink"/>
@@ -3766,7 +3766,7 @@
             <w:noProof/>
             <w:webHidden/>
           </w:rPr>
-          <w:instrText xml:space="preserve"> PAGEREF _Toc244424176 \h </w:instrText>
+          <w:instrText xml:space="preserve"> PAGEREF _Toc244424296 \h </w:instrText>
         </w:r>
         <w:r>
           <w:rPr>
@@ -3814,7 +3814,7 @@
           <w14:ligatures w14:val="standardContextual"/>
         </w:rPr>
       </w:pPr>
-      <w:hyperlink w:anchor="_Toc244424177" w:history="1">
+      <w:hyperlink w:anchor="_Toc244424297" w:history="1">
         <w:r>
           <w:rPr>
             <w:rStyle w:val="Hyperlink"/>
@@ -3841,7 +3841,7 @@
             <w:noProof/>
             <w:webHidden/>
           </w:rPr>
-          <w:instrText xml:space="preserve"> PAGEREF _Toc244424177 \h </w:instrText>
+          <w:instrText xml:space="preserve"> PAGEREF _Toc244424297 \h </w:instrText>
         </w:r>
         <w:r>
           <w:rPr>
@@ -3889,7 +3889,7 @@
           <w14:ligatures w14:val="standardContextual"/>
         </w:rPr>
       </w:pPr>
-      <w:hyperlink w:anchor="_Toc244424178" w:history="1">
+      <w:hyperlink w:anchor="_Toc244424298" w:history="1">
         <w:r>
           <w:rPr>
             <w:rStyle w:val="Hyperlink"/>
@@ -3916,7 +3916,7 @@
             <w:noProof/>
             <w:webHidden/>
           </w:rPr>
-          <w:instrText xml:space="preserve"> PAGEREF _Toc244424178 \h </w:instrText>
+          <w:instrText xml:space="preserve"> PAGEREF _Toc244424298 \h </w:instrText>
         </w:r>
         <w:r>
           <w:rPr>
@@ -3964,7 +3964,7 @@
           <w14:ligatures w14:val="standardContextual"/>
         </w:rPr>
       </w:pPr>
-      <w:hyperlink w:anchor="_Toc244424179" w:history="1">
+      <w:hyperlink w:anchor="_Toc244424299" w:history="1">
         <w:r>
           <w:rPr>
             <w:rStyle w:val="Hyperlink"/>
@@ -3991,7 +3991,7 @@
             <w:noProof/>
             <w:webHidden/>
           </w:rPr>
-          <w:instrText xml:space="preserve"> PAGEREF _Toc244424179 \h </w:instrText>
+          <w:instrText xml:space="preserve"> PAGEREF _Toc244424299 \h </w:instrText>
         </w:r>
         <w:r>
           <w:rPr>
@@ -4039,7 +4039,7 @@
           <w14:ligatures w14:val="standardContextual"/>
         </w:rPr>
       </w:pPr>
-      <w:hyperlink w:anchor="_Toc244424180" w:history="1">
+      <w:hyperlink w:anchor="_Toc244424300" w:history="1">
         <w:r>
           <w:rPr>
             <w:rStyle w:val="Hyperlink"/>
@@ -4066,7 +4066,7 @@
             <w:noProof/>
             <w:webHidden/>
           </w:rPr>
-          <w:instrText xml:space="preserve"> PAGEREF _Toc244424180 \h </w:instrText>
+          <w:instrText xml:space="preserve"> PAGEREF _Toc244424300 \h </w:instrText>
         </w:r>
         <w:r>
           <w:rPr>
@@ -4114,7 +4114,7 @@
           <w14:ligatures w14:val="standardContextual"/>
         </w:rPr>
       </w:pPr>
-      <w:hyperlink w:anchor="_Toc244424181" w:history="1">
+      <w:hyperlink w:anchor="_Toc244424301" w:history="1">
         <w:r>
           <w:rPr>
             <w:rStyle w:val="Hyperlink"/>
@@ -4141,7 +4141,7 @@
             <w:noProof/>
             <w:webHidden/>
           </w:rPr>
-          <w:instrText xml:space="preserve"> PAGEREF _Toc244424181 \h </w:instrText>
+          <w:instrText xml:space="preserve"> PAGEREF _Toc244424301 \h </w:instrText>
         </w:r>
         <w:r>
           <w:rPr>
@@ -4189,7 +4189,7 @@
           <w14:ligatures w14:val="standardContextual"/>
         </w:rPr>
       </w:pPr>
-      <w:hyperlink w:anchor="_Toc244424182" w:history="1">
+      <w:hyperlink w:anchor="_Toc244424302" w:history="1">
         <w:r>
           <w:rPr>
             <w:rStyle w:val="Hyperlink"/>
@@ -4216,7 +4216,7 @@
             <w:noProof/>
             <w:webHidden/>
           </w:rPr>
-          <w:instrText xml:space="preserve"> PAGEREF _Toc244424182 \h </w:instrText>
+          <w:instrText xml:space="preserve"> PAGEREF _Toc244424302 \h </w:instrText>
         </w:r>
         <w:r>
           <w:rPr>
@@ -4264,7 +4264,7 @@
           <w14:ligatures w14:val="standardContextual"/>
         </w:rPr>
       </w:pPr>
-      <w:hyperlink w:anchor="_Toc244424183" w:history="1">
+      <w:hyperlink w:anchor="_Toc244424303" w:history="1">
         <w:r>
           <w:rPr>
             <w:rStyle w:val="Hyperlink"/>
@@ -4291,7 +4291,7 @@
             <w:noProof/>
             <w:webHidden/>
           </w:rPr>
-          <w:instrText xml:space="preserve"> PAGEREF _Toc244424183 \h </w:instrText>
+          <w:instrText xml:space="preserve"> PAGEREF _Toc244424303 \h </w:instrText>
         </w:r>
         <w:r>
           <w:rPr>
@@ -4339,7 +4339,7 @@
           <w14:ligatures w14:val="standardContextual"/>
         </w:rPr>
       </w:pPr>
-      <w:hyperlink w:anchor="_Toc244424184" w:history="1">
+      <w:hyperlink w:anchor="_Toc244424304" w:history="1">
         <w:r>
           <w:rPr>
             <w:rStyle w:val="Hyperlink"/>
@@ -4366,7 +4366,7 @@
             <w:noProof/>
             <w:webHidden/>
           </w:rPr>
-          <w:instrText xml:space="preserve"> PAGEREF _Toc244424184 \h </w:instrText>
+          <w:instrText xml:space="preserve"> PAGEREF _Toc244424304 \h </w:instrText>
         </w:r>
         <w:r>
           <w:rPr>
@@ -4414,7 +4414,7 @@
           <w14:ligatures w14:val="standardContextual"/>
         </w:rPr>
       </w:pPr>
-      <w:hyperlink w:anchor="_Toc244424185" w:history="1">
+      <w:hyperlink w:anchor="_Toc244424305" w:history="1">
         <w:r>
           <w:rPr>
             <w:rStyle w:val="Hyperlink"/>
@@ -4441,7 +4441,7 @@
             <w:noProof/>
             <w:webHidden/>
           </w:rPr>
-          <w:instrText xml:space="preserve"> PAGEREF _Toc244424185 \h </w:instrText>
+          <w:instrText xml:space="preserve"> PAGEREF _Toc244424305 \h </w:instrText>
         </w:r>
         <w:r>
           <w:rPr>
@@ -4489,7 +4489,7 @@
           <w14:ligatures w14:val="standardContextual"/>
         </w:rPr>
       </w:pPr>
-      <w:hyperlink w:anchor="_Toc244424186" w:history="1">
+      <w:hyperlink w:anchor="_Toc244424306" w:history="1">
         <w:r>
           <w:rPr>
             <w:rStyle w:val="Hyperlink"/>
@@ -4516,7 +4516,7 @@
             <w:noProof/>
             <w:webHidden/>
           </w:rPr>
-          <w:instrText xml:space="preserve"> PAGEREF _Toc244424186 \h </w:instrText>
+          <w:instrText xml:space="preserve"> PAGEREF _Toc244424306 \h </w:instrText>
         </w:r>
         <w:r>
           <w:rPr>
@@ -4564,7 +4564,7 @@
           <w14:ligatures w14:val="standardContextual"/>
         </w:rPr>
       </w:pPr>
-      <w:hyperlink w:anchor="_Toc244424187" w:history="1">
+      <w:hyperlink w:anchor="_Toc244424307" w:history="1">
         <w:r>
           <w:rPr>
             <w:rStyle w:val="Hyperlink"/>
@@ -4591,7 +4591,7 @@
             <w:noProof/>
             <w:webHidden/>
           </w:rPr>
-          <w:instrText xml:space="preserve"> PAGEREF _Toc244424187 \h </w:instrText>
+          <w:instrText xml:space="preserve"> PAGEREF _Toc244424307 \h </w:instrText>
         </w:r>
         <w:r>
           <w:rPr>
@@ -4639,7 +4639,7 @@
           <w14:ligatures w14:val="standardContextual"/>
         </w:rPr>
       </w:pPr>
-      <w:hyperlink w:anchor="_Toc244424188" w:history="1">
+      <w:hyperlink w:anchor="_Toc244424308" w:history="1">
         <w:r>
           <w:rPr>
             <w:rStyle w:val="Hyperlink"/>
@@ -4666,7 +4666,7 @@
             <w:noProof/>
             <w:webHidden/>
           </w:rPr>
-          <w:instrText xml:space="preserve"> PAGEREF _Toc244424188 \h </w:instrText>
+          <w:instrText xml:space="preserve"> PAGEREF _Toc244424308 \h </w:instrText>
         </w:r>
         <w:r>
           <w:rPr>
@@ -4714,7 +4714,7 @@
           <w14:ligatures w14:val="standardContextual"/>
         </w:rPr>
       </w:pPr>
-      <w:hyperlink w:anchor="_Toc244424189" w:history="1">
+      <w:hyperlink w:anchor="_Toc244424309" w:history="1">
         <w:r>
           <w:rPr>
             <w:rStyle w:val="Hyperlink"/>
@@ -4741,7 +4741,7 @@
             <w:noProof/>
             <w:webHidden/>
           </w:rPr>
-          <w:instrText xml:space="preserve"> PAGEREF _Toc244424189 \h </w:instrText>
+          <w:instrText xml:space="preserve"> PAGEREF _Toc244424309 \h </w:instrText>
         </w:r>
         <w:r>
           <w:rPr>
@@ -4789,7 +4789,7 @@
           <w14:ligatures w14:val="standardContextual"/>
         </w:rPr>
       </w:pPr>
-      <w:hyperlink w:anchor="_Toc244424190" w:history="1">
+      <w:hyperlink w:anchor="_Toc244424310" w:history="1">
         <w:r>
           <w:rPr>
             <w:rStyle w:val="Hyperlink"/>
@@ -4816,7 +4816,7 @@
             <w:noProof/>
             <w:webHidden/>
           </w:rPr>
-          <w:instrText xml:space="preserve"> PAGEREF _Toc244424190 \h </w:instrText>
+          <w:instrText xml:space="preserve"> PAGEREF _Toc244424310 \h </w:instrText>
         </w:r>
         <w:r>
           <w:rPr>
@@ -4864,7 +4864,7 @@
           <w14:ligatures w14:val="standardContextual"/>
         </w:rPr>
       </w:pPr>
-      <w:hyperlink w:anchor="_Toc244424191" w:history="1">
+      <w:hyperlink w:anchor="_Toc244424311" w:history="1">
         <w:r>
           <w:rPr>
             <w:rStyle w:val="Hyperlink"/>
@@ -4891,7 +4891,7 @@
             <w:noProof/>
             <w:webHidden/>
           </w:rPr>
-          <w:instrText xml:space="preserve"> PAGEREF _Toc244424191 \h </w:instrText>
+          <w:instrText xml:space="preserve"> PAGEREF _Toc244424311 \h </w:instrText>
         </w:r>
         <w:r>
           <w:rPr>
@@ -4939,7 +4939,7 @@
           <w14:ligatures w14:val="standardContextual"/>
         </w:rPr>
       </w:pPr>
-      <w:hyperlink w:anchor="_Toc244424192" w:history="1">
+      <w:hyperlink w:anchor="_Toc244424312" w:history="1">
         <w:r>
           <w:rPr>
             <w:rStyle w:val="Hyperlink"/>
@@ -4966,7 +4966,7 @@
             <w:noProof/>
             <w:webHidden/>
           </w:rPr>
-          <w:instrText xml:space="preserve"> PAGEREF _Toc244424192 \h </w:instrText>
+          <w:instrText xml:space="preserve"> PAGEREF _Toc244424312 \h </w:instrText>
         </w:r>
         <w:r>
           <w:rPr>
@@ -5014,7 +5014,7 @@
           <w14:ligatures w14:val="standardContextual"/>
         </w:rPr>
       </w:pPr>
-      <w:hyperlink w:anchor="_Toc244424193" w:history="1">
+      <w:hyperlink w:anchor="_Toc244424313" w:history="1">
         <w:r>
           <w:rPr>
             <w:rStyle w:val="Hyperlink"/>
@@ -5041,7 +5041,7 @@
             <w:noProof/>
             <w:webHidden/>
           </w:rPr>
-          <w:instrText xml:space="preserve"> PAGEREF _Toc244424193 \h </w:instrText>
+          <w:instrText xml:space="preserve"> PAGEREF _Toc244424313 \h </w:instrText>
         </w:r>
         <w:r>
           <w:rPr>
@@ -5089,7 +5089,7 @@
           <w14:ligatures w14:val="standardContextual"/>
         </w:rPr>
       </w:pPr>
-      <w:hyperlink w:anchor="_Toc244424194" w:history="1">
+      <w:hyperlink w:anchor="_Toc244424314" w:history="1">
         <w:r>
           <w:rPr>
             <w:rStyle w:val="Hyperlink"/>
@@ -5116,7 +5116,7 @@
             <w:noProof/>
             <w:webHidden/>
           </w:rPr>
-          <w:instrText xml:space="preserve"> PAGEREF _Toc244424194 \h </w:instrText>
+          <w:instrText xml:space="preserve"> PAGEREF _Toc244424314 \h </w:instrText>
         </w:r>
         <w:r>
           <w:rPr>
@@ -5164,7 +5164,7 @@
           <w14:ligatures w14:val="standardContextual"/>
         </w:rPr>
       </w:pPr>
-      <w:hyperlink w:anchor="_Toc244424195" w:history="1">
+      <w:hyperlink w:anchor="_Toc244424315" w:history="1">
         <w:r>
           <w:rPr>
             <w:rStyle w:val="Hyperlink"/>
@@ -5191,7 +5191,7 @@
             <w:noProof/>
             <w:webHidden/>
           </w:rPr>
-          <w:instrText xml:space="preserve"> PAGEREF _Toc244424195 \h </w:instrText>
+          <w:instrText xml:space="preserve"> PAGEREF _Toc244424315 \h </w:instrText>
         </w:r>
         <w:r>
           <w:rPr>
@@ -5239,7 +5239,7 @@
           <w14:ligatures w14:val="standardContextual"/>
         </w:rPr>
       </w:pPr>
-      <w:hyperlink w:anchor="_Toc244424196" w:history="1">
+      <w:hyperlink w:anchor="_Toc244424316" w:history="1">
         <w:r>
           <w:rPr>
             <w:rStyle w:val="Hyperlink"/>
@@ -5266,7 +5266,7 @@
             <w:noProof/>
             <w:webHidden/>
           </w:rPr>
-          <w:instrText xml:space="preserve"> PAGEREF _Toc244424196 \h </w:instrText>
+          <w:instrText xml:space="preserve"> PAGEREF _Toc244424316 \h </w:instrText>
         </w:r>
         <w:r>
           <w:rPr>
@@ -5314,7 +5314,7 @@
           <w14:ligatures w14:val="standardContextual"/>
         </w:rPr>
       </w:pPr>
-      <w:hyperlink w:anchor="_Toc244424197" w:history="1">
+      <w:hyperlink w:anchor="_Toc244424317" w:history="1">
         <w:r>
           <w:rPr>
             <w:rStyle w:val="Hyperlink"/>
@@ -5341,7 +5341,7 @@
             <w:noProof/>
             <w:webHidden/>
           </w:rPr>
-          <w:instrText xml:space="preserve"> PAGEREF _Toc244424197 \h </w:instrText>
+          <w:instrText xml:space="preserve"> PAGEREF _Toc244424317 \h </w:instrText>
         </w:r>
         <w:r>
           <w:rPr>
@@ -5389,7 +5389,7 @@
           <w14:ligatures w14:val="standardContextual"/>
         </w:rPr>
       </w:pPr>
-      <w:hyperlink w:anchor="_Toc244424198" w:history="1">
+      <w:hyperlink w:anchor="_Toc244424318" w:history="1">
         <w:r>
           <w:rPr>
             <w:rStyle w:val="Hyperlink"/>
@@ -5416,7 +5416,7 @@
             <w:noProof/>
             <w:webHidden/>
           </w:rPr>
-          <w:instrText xml:space="preserve"> PAGEREF _Toc244424198 \h </w:instrText>
+          <w:instrText xml:space="preserve"> PAGEREF _Toc244424318 \h </w:instrText>
         </w:r>
         <w:r>
           <w:rPr>
@@ -5464,7 +5464,7 @@
           <w14:ligatures w14:val="standardContextual"/>
         </w:rPr>
       </w:pPr>
-      <w:hyperlink w:anchor="_Toc244424199" w:history="1">
+      <w:hyperlink w:anchor="_Toc244424319" w:history="1">
         <w:r>
           <w:rPr>
             <w:rStyle w:val="Hyperlink"/>
@@ -5491,7 +5491,7 @@
             <w:noProof/>
             <w:webHidden/>
           </w:rPr>
-          <w:instrText xml:space="preserve"> PAGEREF _Toc244424199 \h </w:instrText>
+          <w:instrText xml:space="preserve"> PAGEREF _Toc244424319 \h </w:instrText>
         </w:r>
         <w:r>
           <w:rPr>
@@ -5539,7 +5539,7 @@
           <w14:ligatures w14:val="standardContextual"/>
         </w:rPr>
       </w:pPr>
-      <w:hyperlink w:anchor="_Toc244424200" w:history="1">
+      <w:hyperlink w:anchor="_Toc244424320" w:history="1">
         <w:r>
           <w:rPr>
             <w:rStyle w:val="Hyperlink"/>
@@ -5566,7 +5566,7 @@
             <w:noProof/>
             <w:webHidden/>
           </w:rPr>
-          <w:instrText xml:space="preserve"> PAGEREF _Toc244424200 \h </w:instrText>
+          <w:instrText xml:space="preserve"> PAGEREF _Toc244424320 \h </w:instrText>
         </w:r>
         <w:r>
           <w:rPr>
@@ -5614,7 +5614,7 @@
           <w14:ligatures w14:val="standardContextual"/>
         </w:rPr>
       </w:pPr>
-      <w:hyperlink w:anchor="_Toc244424201" w:history="1">
+      <w:hyperlink w:anchor="_Toc244424321" w:history="1">
         <w:r>
           <w:rPr>
             <w:rStyle w:val="Hyperlink"/>
@@ -5641,7 +5641,7 @@
             <w:noProof/>
             <w:webHidden/>
           </w:rPr>
-          <w:instrText xml:space="preserve"> PAGEREF _Toc244424201 \h </w:instrText>
+          <w:instrText xml:space="preserve"> PAGEREF _Toc244424321 \h </w:instrText>
         </w:r>
         <w:r>
           <w:rPr>
@@ -5689,7 +5689,7 @@
           <w14:ligatures w14:val="standardContextual"/>
         </w:rPr>
       </w:pPr>
-      <w:hyperlink w:anchor="_Toc244424202" w:history="1">
+      <w:hyperlink w:anchor="_Toc244424322" w:history="1">
         <w:r>
           <w:rPr>
             <w:rStyle w:val="Hyperlink"/>
@@ -5716,7 +5716,7 @@
             <w:noProof/>
             <w:webHidden/>
           </w:rPr>
-          <w:instrText xml:space="preserve"> PAGEREF _Toc244424202 \h </w:instrText>
+          <w:instrText xml:space="preserve"> PAGEREF _Toc244424322 \h </w:instrText>
         </w:r>
         <w:r>
           <w:rPr>
@@ -5764,7 +5764,7 @@
           <w14:ligatures w14:val="standardContextual"/>
         </w:rPr>
       </w:pPr>
-      <w:hyperlink w:anchor="_Toc244424203" w:history="1">
+      <w:hyperlink w:anchor="_Toc244424323" w:history="1">
         <w:r>
           <w:rPr>
             <w:rStyle w:val="Hyperlink"/>
@@ -5791,7 +5791,7 @@
             <w:noProof/>
             <w:webHidden/>
           </w:rPr>
-          <w:instrText xml:space="preserve"> PAGEREF _Toc244424203 \h </w:instrText>
+          <w:instrText xml:space="preserve"> PAGEREF _Toc244424323 \h </w:instrText>
         </w:r>
         <w:r>
           <w:rPr>
@@ -5839,7 +5839,7 @@
           <w14:ligatures w14:val="standardContextual"/>
         </w:rPr>
       </w:pPr>
-      <w:hyperlink w:anchor="_Toc244424204" w:history="1">
+      <w:hyperlink w:anchor="_Toc244424324" w:history="1">
         <w:r>
           <w:rPr>
             <w:rStyle w:val="Hyperlink"/>
@@ -5866,7 +5866,7 @@
             <w:noProof/>
             <w:webHidden/>
           </w:rPr>
-          <w:instrText xml:space="preserve"> PAGEREF _Toc244424204 \h </w:instrText>
+          <w:instrText xml:space="preserve"> PAGEREF _Toc244424324 \h </w:instrText>
         </w:r>
         <w:r>
           <w:rPr>
@@ -5914,7 +5914,7 @@
           <w14:ligatures w14:val="standardContextual"/>
         </w:rPr>
       </w:pPr>
-      <w:hyperlink w:anchor="_Toc244424205" w:history="1">
+      <w:hyperlink w:anchor="_Toc244424325" w:history="1">
         <w:r>
           <w:rPr>
             <w:rStyle w:val="Hyperlink"/>
@@ -5941,7 +5941,7 @@
             <w:noProof/>
             <w:webHidden/>
           </w:rPr>
-          <w:instrText xml:space="preserve"> PAGEREF _Toc244424205 \h </w:instrText>
+          <w:instrText xml:space="preserve"> PAGEREF _Toc244424325 \h </w:instrText>
         </w:r>
         <w:r>
           <w:rPr>
@@ -5989,7 +5989,7 @@
           <w14:ligatures w14:val="standardContextual"/>
         </w:rPr>
       </w:pPr>
-      <w:hyperlink w:anchor="_Toc244424206" w:history="1">
+      <w:hyperlink w:anchor="_Toc244424326" w:history="1">
         <w:r>
           <w:rPr>
             <w:rStyle w:val="Hyperlink"/>
@@ -6016,7 +6016,7 @@
             <w:noProof/>
             <w:webHidden/>
           </w:rPr>
-          <w:instrText xml:space="preserve"> PAGEREF _Toc244424206 \h </w:instrText>
+          <w:instrText xml:space="preserve"> PAGEREF _Toc244424326 \h </w:instrText>
         </w:r>
         <w:r>
           <w:rPr>
@@ -6064,7 +6064,7 @@
           <w14:ligatures w14:val="standardContextual"/>
         </w:rPr>
       </w:pPr>
-      <w:hyperlink w:anchor="_Toc244424207" w:history="1">
+      <w:hyperlink w:anchor="_Toc244424327" w:history="1">
         <w:r>
           <w:rPr>
             <w:rStyle w:val="Hyperlink"/>
@@ -6091,7 +6091,7 @@
             <w:noProof/>
             <w:webHidden/>
           </w:rPr>
-          <w:instrText xml:space="preserve"> PAGEREF _Toc244424207 \h </w:instrText>
+          <w:instrText xml:space="preserve"> PAGEREF _Toc244424327 \h </w:instrText>
         </w:r>
         <w:r>
           <w:rPr>
@@ -6139,7 +6139,7 @@
           <w14:ligatures w14:val="standardContextual"/>
         </w:rPr>
       </w:pPr>
-      <w:hyperlink w:anchor="_Toc244424208" w:history="1">
+      <w:hyperlink w:anchor="_Toc244424328" w:history="1">
         <w:r>
           <w:rPr>
             <w:rStyle w:val="Hyperlink"/>
@@ -6166,7 +6166,7 @@
             <w:noProof/>
             <w:webHidden/>
           </w:rPr>
-          <w:instrText xml:space="preserve"> PAGEREF _Toc244424208 \h </w:instrText>
+          <w:instrText xml:space="preserve"> PAGEREF _Toc244424328 \h </w:instrText>
         </w:r>
         <w:r>
           <w:rPr>
@@ -6216,7 +6216,7 @@
         <w:lastRenderedPageBreak/>
         <w:t xml:space="preserve"> </w:t>
       </w:r>
-      <w:bookmarkStart w:id="4" w:name="_Toc244424148"/>
+      <w:bookmarkStart w:id="4" w:name="_Toc244424268"/>
       <w:r>
         <w:rPr>
           <w:rFonts w:ascii="Calibri" w:hAnsi="Calibri"/>
@@ -6244,7 +6244,7 @@
           <w:bottom w:val="single" w:sz="8" w:space="3" w:color="DBEAFE"/>
         </w:pBdr>
       </w:pPr>
-      <w:bookmarkStart w:id="5" w:name="_Toc244424149"/>
+      <w:bookmarkStart w:id="5" w:name="_Toc244424269"/>
       <w:r>
         <w:rPr>
           <w:rFonts w:ascii="Calibri" w:hAnsi="Calibri"/>
@@ -6284,7 +6284,7 @@
           <w:bottom w:val="single" w:sz="8" w:space="3" w:color="DBEAFE"/>
         </w:pBdr>
       </w:pPr>
-      <w:bookmarkStart w:id="6" w:name="_Toc244424150"/>
+      <w:bookmarkStart w:id="6" w:name="_Toc244424270"/>
       <w:r>
         <w:rPr>
           <w:rFonts w:ascii="Calibri" w:hAnsi="Calibri"/>
@@ -6632,7 +6632,7 @@
           <w:bottom w:val="single" w:sz="8" w:space="3" w:color="DBEAFE"/>
         </w:pBdr>
       </w:pPr>
-      <w:bookmarkStart w:id="7" w:name="_Toc244424151"/>
+      <w:bookmarkStart w:id="7" w:name="_Toc244424271"/>
       <w:r>
         <w:rPr>
           <w:rFonts w:ascii="Calibri" w:hAnsi="Calibri"/>
@@ -7130,7 +7130,7 @@
         <w:lastRenderedPageBreak/>
         <w:t xml:space="preserve"> </w:t>
       </w:r>
-      <w:bookmarkStart w:id="8" w:name="_Toc244424152"/>
+      <w:bookmarkStart w:id="8" w:name="_Toc244424272"/>
       <w:r>
         <w:rPr>
           <w:rFonts w:ascii="Calibri" w:hAnsi="Calibri"/>
@@ -8358,7 +8358,7 @@
           <w:bottom w:val="single" w:sz="8" w:space="3" w:color="DBEAFE"/>
         </w:pBdr>
       </w:pPr>
-      <w:bookmarkStart w:id="9" w:name="_Toc244424153"/>
+      <w:bookmarkStart w:id="9" w:name="_Toc244424273"/>
       <w:r>
         <w:rPr>
           <w:rFonts w:ascii="Calibri" w:hAnsi="Calibri"/>
@@ -8708,7 +8708,7 @@
           <w:bottom w:val="single" w:sz="8" w:space="3" w:color="DBEAFE"/>
         </w:pBdr>
       </w:pPr>
-      <w:bookmarkStart w:id="10" w:name="_Toc244424154"/>
+      <w:bookmarkStart w:id="10" w:name="_Toc244424274"/>
       <w:r>
         <w:rPr>
           <w:rFonts w:ascii="Calibri" w:hAnsi="Calibri"/>
@@ -8836,7 +8836,7 @@
           <w:bottom w:val="single" w:sz="8" w:space="3" w:color="DBEAFE"/>
         </w:pBdr>
       </w:pPr>
-      <w:bookmarkStart w:id="11" w:name="_Toc244424155"/>
+      <w:bookmarkStart w:id="11" w:name="_Toc244424275"/>
       <w:r>
         <w:rPr>
           <w:rFonts w:ascii="Calibri" w:hAnsi="Calibri"/>
@@ -9189,7 +9189,7 @@
           <w:bottom w:val="single" w:sz="8" w:space="3" w:color="DBEAFE"/>
         </w:pBdr>
       </w:pPr>
-      <w:bookmarkStart w:id="12" w:name="_Toc244424156"/>
+      <w:bookmarkStart w:id="12" w:name="_Toc244424276"/>
       <w:r>
         <w:rPr>
           <w:rFonts w:ascii="Calibri" w:hAnsi="Calibri"/>
@@ -9285,7 +9285,7 @@
         <w:lastRenderedPageBreak/>
         <w:t xml:space="preserve"> </w:t>
       </w:r>
-      <w:bookmarkStart w:id="13" w:name="_Toc244424157"/>
+      <w:bookmarkStart w:id="13" w:name="_Toc244424277"/>
       <w:r>
         <w:rPr>
           <w:rFonts w:ascii="Calibri" w:hAnsi="Calibri"/>
@@ -9313,7 +9313,7 @@
           <w:bottom w:val="single" w:sz="8" w:space="3" w:color="DBEAFE"/>
         </w:pBdr>
       </w:pPr>
-      <w:bookmarkStart w:id="14" w:name="_Toc244424158"/>
+      <w:bookmarkStart w:id="14" w:name="_Toc244424278"/>
       <w:r>
         <w:rPr>
           <w:rFonts w:ascii="Calibri" w:hAnsi="Calibri"/>
@@ -9453,7 +9453,7 @@
           <w:bottom w:val="single" w:sz="8" w:space="3" w:color="DBEAFE"/>
         </w:pBdr>
       </w:pPr>
-      <w:bookmarkStart w:id="15" w:name="_Toc244424159"/>
+      <w:bookmarkStart w:id="15" w:name="_Toc244424279"/>
       <w:r>
         <w:rPr>
           <w:rFonts w:ascii="Calibri" w:hAnsi="Calibri"/>
@@ -9782,7 +9782,7 @@
           <w:bottom w:val="single" w:sz="8" w:space="3" w:color="DBEAFE"/>
         </w:pBdr>
       </w:pPr>
-      <w:bookmarkStart w:id="16" w:name="_Toc244424160"/>
+      <w:bookmarkStart w:id="16" w:name="_Toc244424280"/>
       <w:r>
         <w:rPr>
           <w:rFonts w:ascii="Calibri" w:hAnsi="Calibri"/>
@@ -10055,7 +10055,7 @@
           <w:bottom w:val="single" w:sz="8" w:space="3" w:color="DBEAFE"/>
         </w:pBdr>
       </w:pPr>
-      <w:bookmarkStart w:id="17" w:name="_Toc244424161"/>
+      <w:bookmarkStart w:id="17" w:name="_Toc244424281"/>
       <w:r>
         <w:rPr>
           <w:rFonts w:ascii="Calibri" w:hAnsi="Calibri"/>
@@ -10141,7 +10141,7 @@
           <w:bottom w:val="single" w:sz="8" w:space="3" w:color="DBEAFE"/>
         </w:pBdr>
       </w:pPr>
-      <w:bookmarkStart w:id="18" w:name="_Toc244424162"/>
+      <w:bookmarkStart w:id="18" w:name="_Toc244424282"/>
       <w:r>
         <w:rPr>
           <w:rFonts w:ascii="Calibri" w:hAnsi="Calibri"/>
@@ -10248,7 +10248,7 @@
           <w:bottom w:val="single" w:sz="8" w:space="3" w:color="DBEAFE"/>
         </w:pBdr>
       </w:pPr>
-      <w:bookmarkStart w:id="19" w:name="_Toc244424163"/>
+      <w:bookmarkStart w:id="19" w:name="_Toc244424283"/>
       <w:r>
         <w:rPr>
           <w:rFonts w:ascii="Calibri" w:hAnsi="Calibri"/>
@@ -10332,7 +10332,7 @@
         <w:lastRenderedPageBreak/>
         <w:t xml:space="preserve"> </w:t>
       </w:r>
-      <w:bookmarkStart w:id="20" w:name="_Toc244424164"/>
+      <w:bookmarkStart w:id="20" w:name="_Toc244424284"/>
       <w:r>
         <w:rPr>
           <w:rFonts w:ascii="Calibri" w:hAnsi="Calibri"/>
@@ -10372,7 +10372,7 @@
         </w:rPr>
         <w:t xml:space="preserve"> </w:t>
       </w:r>
-      <w:bookmarkStart w:id="21" w:name="_Toc244424165"/>
+      <w:bookmarkStart w:id="21" w:name="_Toc244424285"/>
       <w:r>
         <w:rPr>
           <w:rFonts w:ascii="Calibri" w:hAnsi="Calibri"/>
@@ -11041,7 +11041,7 @@
         </w:rPr>
         <w:t xml:space="preserve"> </w:t>
       </w:r>
-      <w:bookmarkStart w:id="22" w:name="_Toc244424166"/>
+      <w:bookmarkStart w:id="22" w:name="_Toc244424286"/>
       <w:r>
         <w:rPr>
           <w:rFonts w:ascii="Calibri" w:hAnsi="Calibri"/>
@@ -11716,7 +11716,7 @@
         <w:lastRenderedPageBreak/>
         <w:t xml:space="preserve"> </w:t>
       </w:r>
-      <w:bookmarkStart w:id="23" w:name="_Toc244424167"/>
+      <w:bookmarkStart w:id="23" w:name="_Toc244424287"/>
       <w:r>
         <w:rPr>
           <w:rFonts w:ascii="Calibri" w:hAnsi="Calibri"/>
@@ -12324,7 +12324,7 @@
         </w:rPr>
         <w:t xml:space="preserve"> </w:t>
       </w:r>
-      <w:bookmarkStart w:id="24" w:name="_Toc244424168"/>
+      <w:bookmarkStart w:id="24" w:name="_Toc244424288"/>
       <w:r>
         <w:rPr>
           <w:rFonts w:ascii="Calibri" w:hAnsi="Calibri"/>
@@ -12916,7 +12916,7 @@
         </w:rPr>
         <w:t xml:space="preserve"> </w:t>
       </w:r>
-      <w:bookmarkStart w:id="25" w:name="_Toc244424169"/>
+      <w:bookmarkStart w:id="25" w:name="_Toc244424289"/>
       <w:r>
         <w:rPr>
           <w:rFonts w:ascii="Calibri" w:hAnsi="Calibri"/>
@@ -13525,7 +13525,7 @@
         </w:rPr>
         <w:t xml:space="preserve"> </w:t>
       </w:r>
-      <w:bookmarkStart w:id="26" w:name="_Toc244424170"/>
+      <w:bookmarkStart w:id="26" w:name="_Toc244424290"/>
       <w:r>
         <w:rPr>
           <w:rFonts w:ascii="Calibri" w:hAnsi="Calibri"/>
@@ -14195,7 +14195,7 @@
         </w:rPr>
         <w:t xml:space="preserve"> </w:t>
       </w:r>
-      <w:bookmarkStart w:id="27" w:name="_Toc244424171"/>
+      <w:bookmarkStart w:id="27" w:name="_Toc244424291"/>
       <w:r>
         <w:rPr>
           <w:rFonts w:ascii="Calibri" w:hAnsi="Calibri"/>
@@ -14831,7 +14831,7 @@
         </w:rPr>
         <w:t xml:space="preserve"> </w:t>
       </w:r>
-      <w:bookmarkStart w:id="28" w:name="_Toc244424172"/>
+      <w:bookmarkStart w:id="28" w:name="_Toc244424292"/>
       <w:r>
         <w:rPr>
           <w:rFonts w:ascii="Calibri" w:hAnsi="Calibri"/>
@@ -15646,7 +15646,7 @@
         </w:rPr>
         <w:t xml:space="preserve"> </w:t>
       </w:r>
-      <w:bookmarkStart w:id="29" w:name="_Toc244424173"/>
+      <w:bookmarkStart w:id="29" w:name="_Toc244424293"/>
       <w:r>
         <w:rPr>
           <w:rFonts w:ascii="Calibri" w:hAnsi="Calibri"/>
@@ -16421,7 +16421,7 @@
         <w:lastRenderedPageBreak/>
         <w:t xml:space="preserve"> </w:t>
       </w:r>
-      <w:bookmarkStart w:id="30" w:name="_Toc244424174"/>
+      <w:bookmarkStart w:id="30" w:name="_Toc244424294"/>
       <w:r>
         <w:rPr>
           <w:rFonts w:ascii="Calibri" w:hAnsi="Calibri"/>
@@ -17027,7 +17027,7 @@
         <w:lastRenderedPageBreak/>
         <w:t xml:space="preserve"> </w:t>
       </w:r>
-      <w:bookmarkStart w:id="31" w:name="_Toc244424175"/>
+      <w:bookmarkStart w:id="31" w:name="_Toc244424295"/>
       <w:r>
         <w:rPr>
           <w:rFonts w:ascii="Calibri" w:hAnsi="Calibri"/>
@@ -17067,7 +17067,7 @@
         </w:rPr>
         <w:t xml:space="preserve"> </w:t>
       </w:r>
-      <w:bookmarkStart w:id="32" w:name="_Toc244424176"/>
+      <w:bookmarkStart w:id="32" w:name="_Toc244424296"/>
       <w:r>
         <w:rPr>
           <w:rFonts w:ascii="Calibri" w:hAnsi="Calibri"/>
@@ -17695,7 +17695,7 @@
         <w:lastRenderedPageBreak/>
         <w:t xml:space="preserve"> </w:t>
       </w:r>
-      <w:bookmarkStart w:id="33" w:name="_Toc244424177"/>
+      <w:bookmarkStart w:id="33" w:name="_Toc244424297"/>
       <w:r>
         <w:rPr>
           <w:rFonts w:ascii="Calibri" w:hAnsi="Calibri"/>
@@ -18311,7 +18311,7 @@
         </w:rPr>
         <w:t xml:space="preserve"> </w:t>
       </w:r>
-      <w:bookmarkStart w:id="34" w:name="_Toc244424178"/>
+      <w:bookmarkStart w:id="34" w:name="_Toc244424298"/>
       <w:r>
         <w:rPr>
           <w:rFonts w:ascii="Calibri" w:hAnsi="Calibri"/>
@@ -18902,7 +18902,7 @@
         <w:lastRenderedPageBreak/>
         <w:t xml:space="preserve"> </w:t>
       </w:r>
-      <w:bookmarkStart w:id="35" w:name="_Toc244424179"/>
+      <w:bookmarkStart w:id="35" w:name="_Toc244424299"/>
       <w:r>
         <w:rPr>
           <w:rFonts w:ascii="Calibri" w:hAnsi="Calibri"/>
@@ -18938,7 +18938,7 @@
           <w:bottom w:val="single" w:sz="8" w:space="3" w:color="DBEAFE"/>
         </w:pBdr>
       </w:pPr>
-      <w:bookmarkStart w:id="36" w:name="_Toc244424180"/>
+      <w:bookmarkStart w:id="36" w:name="_Toc244424300"/>
       <w:r>
         <w:rPr>
           <w:rFonts w:ascii="Calibri" w:hAnsi="Calibri"/>
@@ -19426,7 +19426,7 @@
           <w:bottom w:val="single" w:sz="8" w:space="3" w:color="DBEAFE"/>
         </w:pBdr>
       </w:pPr>
-      <w:bookmarkStart w:id="37" w:name="_Toc244424181"/>
+      <w:bookmarkStart w:id="37" w:name="_Toc244424301"/>
       <w:r>
         <w:rPr>
           <w:rFonts w:ascii="Calibri" w:hAnsi="Calibri"/>
@@ -19489,7 +19489,7 @@
           <w:bottom w:val="single" w:sz="8" w:space="3" w:color="DBEAFE"/>
         </w:pBdr>
       </w:pPr>
-      <w:bookmarkStart w:id="38" w:name="_Toc244424182"/>
+      <w:bookmarkStart w:id="38" w:name="_Toc244424302"/>
       <w:r>
         <w:rPr>
           <w:rFonts w:ascii="Calibri" w:hAnsi="Calibri"/>
@@ -19500,7 +19500,7 @@
     </w:p>
     <w:p>
       <w:r>
-        <w:t>C'est la batteries de questions à faire devant la classe, dans cet ordre. Elle est déjà scriptée dans etape8.py --demo ; vous pouvez aussi la jouer dans app_final.py.</w:t>
+        <w:t>C'est la batterie de questions à faire devant la classe, dans cet ordre. Elle est déjà scriptée dans etape8.py --demo ; vous pouvez aussi la jouer dans app_final.py.</w:t>
       </w:r>
     </w:p>
     <w:tbl>
@@ -20139,7 +20139,7 @@
           <w:bottom w:val="single" w:sz="8" w:space="3" w:color="DBEAFE"/>
         </w:pBdr>
       </w:pPr>
-      <w:bookmarkStart w:id="39" w:name="_Toc244424183"/>
+      <w:bookmarkStart w:id="39" w:name="_Toc244424303"/>
       <w:r>
         <w:rPr>
           <w:rFonts w:ascii="Calibri" w:hAnsi="Calibri"/>
@@ -20417,7 +20417,7 @@
           <w:bottom w:val="single" w:sz="8" w:space="3" w:color="DBEAFE"/>
         </w:pBdr>
       </w:pPr>
-      <w:bookmarkStart w:id="40" w:name="_Toc244424184"/>
+      <w:bookmarkStart w:id="40" w:name="_Toc244424304"/>
       <w:r>
         <w:rPr>
           <w:rFonts w:ascii="Calibri" w:hAnsi="Calibri"/>
@@ -20746,7 +20746,7 @@
           <w:bottom w:val="single" w:sz="8" w:space="3" w:color="DBEAFE"/>
         </w:pBdr>
       </w:pPr>
-      <w:bookmarkStart w:id="41" w:name="_Toc244424185"/>
+      <w:bookmarkStart w:id="41" w:name="_Toc244424305"/>
       <w:r>
         <w:rPr>
           <w:rFonts w:ascii="Calibri" w:hAnsi="Calibri"/>
@@ -21133,7 +21133,7 @@
           <w:bottom w:val="single" w:sz="8" w:space="3" w:color="DBEAFE"/>
         </w:pBdr>
       </w:pPr>
-      <w:bookmarkStart w:id="42" w:name="_Toc244424186"/>
+      <w:bookmarkStart w:id="42" w:name="_Toc244424306"/>
       <w:r>
         <w:rPr>
           <w:rFonts w:ascii="Calibri" w:hAnsi="Calibri"/>
@@ -21239,7 +21239,7 @@
           <w:bottom w:val="single" w:sz="8" w:space="3" w:color="DBEAFE"/>
         </w:pBdr>
       </w:pPr>
-      <w:bookmarkStart w:id="43" w:name="_Toc244424187"/>
+      <w:bookmarkStart w:id="43" w:name="_Toc244424307"/>
       <w:r>
         <w:rPr>
           <w:rFonts w:ascii="Calibri" w:hAnsi="Calibri"/>
@@ -21321,7 +21321,7 @@
           <w:bottom w:val="single" w:sz="8" w:space="3" w:color="DBEAFE"/>
         </w:pBdr>
       </w:pPr>
-      <w:bookmarkStart w:id="44" w:name="_Toc244424188"/>
+      <w:bookmarkStart w:id="44" w:name="_Toc244424308"/>
       <w:r>
         <w:rPr>
           <w:rFonts w:ascii="Calibri" w:hAnsi="Calibri"/>
@@ -21402,7 +21402,7 @@
         <w:lastRenderedPageBreak/>
         <w:t xml:space="preserve"> </w:t>
       </w:r>
-      <w:bookmarkStart w:id="45" w:name="_Toc244424189"/>
+      <w:bookmarkStart w:id="45" w:name="_Toc244424309"/>
       <w:r>
         <w:rPr>
           <w:rFonts w:ascii="Calibri" w:hAnsi="Calibri"/>
@@ -22095,7 +22095,7 @@
           <w:bottom w:val="single" w:sz="8" w:space="3" w:color="DBEAFE"/>
         </w:pBdr>
       </w:pPr>
-      <w:bookmarkStart w:id="46" w:name="_Toc244424190"/>
+      <w:bookmarkStart w:id="46" w:name="_Toc244424310"/>
       <w:r>
         <w:rPr>
           <w:rFonts w:ascii="Calibri" w:hAnsi="Calibri"/>
@@ -22214,7 +22214,7 @@
           <w:bottom w:val="single" w:sz="8" w:space="3" w:color="DBEAFE"/>
         </w:pBdr>
       </w:pPr>
-      <w:bookmarkStart w:id="47" w:name="_Toc244424191"/>
+      <w:bookmarkStart w:id="47" w:name="_Toc244424311"/>
       <w:r>
         <w:rPr>
           <w:rFonts w:ascii="Calibri" w:hAnsi="Calibri"/>
@@ -22240,7 +22240,7 @@
           <w:bottom w:val="single" w:sz="8" w:space="3" w:color="DBEAFE"/>
         </w:pBdr>
       </w:pPr>
-      <w:bookmarkStart w:id="48" w:name="_Toc244424192"/>
+      <w:bookmarkStart w:id="48" w:name="_Toc244424312"/>
       <w:r>
         <w:rPr>
           <w:rFonts w:ascii="Calibri" w:hAnsi="Calibri"/>
@@ -22266,7 +22266,7 @@
           <w:bottom w:val="single" w:sz="8" w:space="3" w:color="DBEAFE"/>
         </w:pBdr>
       </w:pPr>
-      <w:bookmarkStart w:id="49" w:name="_Toc244424193"/>
+      <w:bookmarkStart w:id="49" w:name="_Toc244424313"/>
       <w:r>
         <w:rPr>
           <w:rFonts w:ascii="Calibri" w:hAnsi="Calibri"/>
@@ -22293,7 +22293,7 @@
           <w:bottom w:val="single" w:sz="8" w:space="3" w:color="DBEAFE"/>
         </w:pBdr>
       </w:pPr>
-      <w:bookmarkStart w:id="50" w:name="_Toc244424194"/>
+      <w:bookmarkStart w:id="50" w:name="_Toc244424314"/>
       <w:r>
         <w:rPr>
           <w:rFonts w:ascii="Calibri" w:hAnsi="Calibri"/>
@@ -22319,7 +22319,7 @@
           <w:bottom w:val="single" w:sz="8" w:space="3" w:color="DBEAFE"/>
         </w:pBdr>
       </w:pPr>
-      <w:bookmarkStart w:id="51" w:name="_Toc244424195"/>
+      <w:bookmarkStart w:id="51" w:name="_Toc244424315"/>
       <w:r>
         <w:rPr>
           <w:rFonts w:ascii="Calibri" w:hAnsi="Calibri"/>
@@ -22345,7 +22345,7 @@
           <w:bottom w:val="single" w:sz="8" w:space="3" w:color="DBEAFE"/>
         </w:pBdr>
       </w:pPr>
-      <w:bookmarkStart w:id="52" w:name="_Toc244424196"/>
+      <w:bookmarkStart w:id="52" w:name="_Toc244424316"/>
       <w:r>
         <w:rPr>
           <w:rFonts w:ascii="Calibri" w:hAnsi="Calibri"/>
@@ -22739,7 +22739,7 @@
         <w:lastRenderedPageBreak/>
         <w:t xml:space="preserve"> </w:t>
       </w:r>
-      <w:bookmarkStart w:id="53" w:name="_Toc244424197"/>
+      <w:bookmarkStart w:id="53" w:name="_Toc244424317"/>
       <w:r>
         <w:rPr>
           <w:rFonts w:ascii="Calibri" w:hAnsi="Calibri"/>
@@ -23808,7 +23808,7 @@
           <w:bottom w:val="single" w:sz="8" w:space="3" w:color="DBEAFE"/>
         </w:pBdr>
       </w:pPr>
-      <w:bookmarkStart w:id="54" w:name="_Toc244424198"/>
+      <w:bookmarkStart w:id="54" w:name="_Toc244424318"/>
       <w:r>
         <w:rPr>
           <w:rFonts w:ascii="Calibri" w:hAnsi="Calibri"/>
@@ -23848,7 +23848,7 @@
           <w:bottom w:val="single" w:sz="8" w:space="3" w:color="DBEAFE"/>
         </w:pBdr>
       </w:pPr>
-      <w:bookmarkStart w:id="55" w:name="_Toc244424199"/>
+      <w:bookmarkStart w:id="55" w:name="_Toc244424319"/>
       <w:r>
         <w:rPr>
           <w:rFonts w:ascii="Calibri" w:hAnsi="Calibri"/>
@@ -23888,7 +23888,7 @@
           <w:bottom w:val="single" w:sz="8" w:space="3" w:color="DBEAFE"/>
         </w:pBdr>
       </w:pPr>
-      <w:bookmarkStart w:id="56" w:name="_Toc244424200"/>
+      <w:bookmarkStart w:id="56" w:name="_Toc244424320"/>
       <w:r>
         <w:rPr>
           <w:rFonts w:ascii="Calibri" w:hAnsi="Calibri"/>
@@ -24138,7 +24138,7 @@
         <w:lastRenderedPageBreak/>
         <w:t xml:space="preserve"> </w:t>
       </w:r>
-      <w:bookmarkStart w:id="57" w:name="_Toc244424201"/>
+      <w:bookmarkStart w:id="57" w:name="_Toc244424321"/>
       <w:r>
         <w:rPr>
           <w:rFonts w:ascii="Calibri" w:hAnsi="Calibri"/>
@@ -25252,7 +25252,7 @@
         <w:lastRenderedPageBreak/>
         <w:t xml:space="preserve"> </w:t>
       </w:r>
-      <w:bookmarkStart w:id="58" w:name="_Toc244424202"/>
+      <w:bookmarkStart w:id="58" w:name="_Toc244424322"/>
       <w:r>
         <w:rPr>
           <w:rFonts w:ascii="Calibri" w:hAnsi="Calibri"/>
@@ -25280,7 +25280,7 @@
           <w:bottom w:val="single" w:sz="8" w:space="3" w:color="DBEAFE"/>
         </w:pBdr>
       </w:pPr>
-      <w:bookmarkStart w:id="59" w:name="_Toc244424203"/>
+      <w:bookmarkStart w:id="59" w:name="_Toc244424323"/>
       <w:r>
         <w:rPr>
           <w:rFonts w:ascii="Calibri" w:hAnsi="Calibri"/>
@@ -25460,7 +25460,7 @@
           <w:bottom w:val="single" w:sz="8" w:space="3" w:color="DBEAFE"/>
         </w:pBdr>
       </w:pPr>
-      <w:bookmarkStart w:id="60" w:name="_Toc244424204"/>
+      <w:bookmarkStart w:id="60" w:name="_Toc244424324"/>
       <w:r>
         <w:rPr>
           <w:rFonts w:ascii="Calibri" w:hAnsi="Calibri"/>
@@ -26714,7 +26714,7 @@
           <w:bottom w:val="single" w:sz="8" w:space="3" w:color="DBEAFE"/>
         </w:pBdr>
       </w:pPr>
-      <w:bookmarkStart w:id="61" w:name="_Toc244424205"/>
+      <w:bookmarkStart w:id="61" w:name="_Toc244424325"/>
       <w:r>
         <w:rPr>
           <w:rFonts w:ascii="Calibri" w:hAnsi="Calibri"/>
@@ -27338,7 +27338,7 @@
           <w:bottom w:val="single" w:sz="8" w:space="3" w:color="DBEAFE"/>
         </w:pBdr>
       </w:pPr>
-      <w:bookmarkStart w:id="62" w:name="_Toc244424206"/>
+      <w:bookmarkStart w:id="62" w:name="_Toc244424326"/>
       <w:r>
         <w:rPr>
           <w:rFonts w:ascii="Calibri" w:hAnsi="Calibri"/>
@@ -28103,7 +28103,7 @@
           <w:bottom w:val="single" w:sz="8" w:space="3" w:color="DBEAFE"/>
         </w:pBdr>
       </w:pPr>
-      <w:bookmarkStart w:id="63" w:name="_Toc244424207"/>
+      <w:bookmarkStart w:id="63" w:name="_Toc244424327"/>
       <w:r>
         <w:rPr>
           <w:rFonts w:ascii="Calibri" w:hAnsi="Calibri"/>
@@ -28185,7 +28185,7 @@
           <w:bottom w:val="single" w:sz="8" w:space="3" w:color="DBEAFE"/>
         </w:pBdr>
       </w:pPr>
-      <w:bookmarkStart w:id="64" w:name="_Toc244424208"/>
+      <w:bookmarkStart w:id="64" w:name="_Toc244424328"/>
       <w:r>
         <w:rPr>
           <w:rFonts w:ascii="Calibri" w:hAnsi="Calibri"/>
@@ -28637,31 +28637,31 @@
       </w:rPr>
     </w:lvl>
   </w:abstractNum>
-  <w:num w:numId="1" w16cid:durableId="326522147">
+  <w:num w:numId="1" w16cid:durableId="1457261208">
     <w:abstractNumId w:val="8"/>
   </w:num>
-  <w:num w:numId="2" w16cid:durableId="798259917">
+  <w:num w:numId="2" w16cid:durableId="520553934">
     <w:abstractNumId w:val="6"/>
   </w:num>
-  <w:num w:numId="3" w16cid:durableId="782961659">
+  <w:num w:numId="3" w16cid:durableId="1983197122">
     <w:abstractNumId w:val="5"/>
   </w:num>
-  <w:num w:numId="4" w16cid:durableId="550457541">
+  <w:num w:numId="4" w16cid:durableId="1027175306">
     <w:abstractNumId w:val="4"/>
   </w:num>
-  <w:num w:numId="5" w16cid:durableId="717121445">
+  <w:num w:numId="5" w16cid:durableId="1692604517">
     <w:abstractNumId w:val="7"/>
   </w:num>
-  <w:num w:numId="6" w16cid:durableId="2094623963">
+  <w:num w:numId="6" w16cid:durableId="1992950603">
     <w:abstractNumId w:val="3"/>
   </w:num>
-  <w:num w:numId="7" w16cid:durableId="528688736">
+  <w:num w:numId="7" w16cid:durableId="1797334234">
     <w:abstractNumId w:val="2"/>
   </w:num>
-  <w:num w:numId="8" w16cid:durableId="1030180884">
+  <w:num w:numId="8" w16cid:durableId="589238489">
     <w:abstractNumId w:val="1"/>
   </w:num>
-  <w:num w:numId="9" w16cid:durableId="415635722">
+  <w:num w:numId="9" w16cid:durableId="1112021199">
     <w:abstractNumId w:val="0"/>
   </w:num>
 </w:numbering>
@@ -40066,7 +40066,7 @@
     <w:autoRedefine/>
     <w:uiPriority w:val="39"/>
     <w:unhideWhenUsed/>
-    <w:rsid w:val="0071676B"/>
+    <w:rsid w:val="00F56662"/>
   </w:style>
   <w:style w:type="paragraph" w:styleId="TOC2">
     <w:name w:val="toc 2"/>
@@ -40075,7 +40075,7 @@
     <w:autoRedefine/>
     <w:uiPriority w:val="39"/>
     <w:unhideWhenUsed/>
-    <w:rsid w:val="0071676B"/>
+    <w:rsid w:val="00F56662"/>
     <w:pPr>
       <w:ind w:left="210"/>
     </w:pPr>
@@ -40085,7 +40085,7 @@
     <w:basedOn w:val="DefaultParagraphFont"/>
     <w:uiPriority w:val="99"/>
     <w:unhideWhenUsed/>
-    <w:rsid w:val="0071676B"/>
+    <w:rsid w:val="00F56662"/>
     <w:rPr>
       <w:color w:val="0000FF" w:themeColor="hyperlink"/>
       <w:u w:val="single"/>

</xml_diff>

<commit_message>
Livre reel indexe : demarrage rapide et citations verifiees
- index_livre.py : en_cache() + charger(pages=...) pour ne plus extraire
  un livre deja indexe au demarrage (33 s -> 1 s a froid sur 844 pages)
- app_final.py : le cache est consulte avant toute extraction ; budget de
  pages partage entre plusieurs livres ; consigne de citation clarifiee ;
  un echo d'en-tete renvoye par le modele est retire (contenu inchange) ;
  notes de cours .docx non tronquees a 6 000 caracteres (68 000 au total),
  donc useReducer n'est plus refuse
- etape8.py : meme cache, meme nettoyage ; garde corrigee (comparaison par
  mots entiers : "tarte" ne matchait plus "started")
- etape10_ressources.py : message generique sur cours/livres/
- documentation : conducteur 33 pages aligne sur le livre depose
  (844 pages, 1 696 morceaux, citations p.565)

Verifie : 6 demos etape8 (5 chemins), HTTP app_final, exe HTTP 200 + p.565.
</commit_message>
<xml_diff>
--- a/documentation/Conducteur_Atelier_Agent_IA_2h.docx
+++ b/documentation/Conducteur_Atelier_Agent_IA_2h.docx
@@ -327,7 +327,7 @@
         <w:lastRenderedPageBreak/>
         <w:t xml:space="preserve"> </w:t>
       </w:r>
-      <w:bookmarkStart w:id="0" w:name="_Toc244455906"/>
+      <w:bookmarkStart w:id="0" w:name="_Toc244457193"/>
       <w:r>
         <w:rPr>
           <w:rFonts w:ascii="Calibri" w:hAnsi="Calibri"/>
@@ -623,7 +623,7 @@
           <w:bottom w:val="single" w:sz="8" w:space="3" w:color="DBEAFE"/>
         </w:pBdr>
       </w:pPr>
-      <w:bookmarkStart w:id="1" w:name="_Toc244455907"/>
+      <w:bookmarkStart w:id="1" w:name="_Toc244457194"/>
       <w:r>
         <w:rPr>
           <w:rFonts w:ascii="Calibri" w:hAnsi="Calibri"/>
@@ -767,7 +767,7 @@
           <w:bottom w:val="single" w:sz="8" w:space="3" w:color="DBEAFE"/>
         </w:pBdr>
       </w:pPr>
-      <w:bookmarkStart w:id="2" w:name="_Toc244455908"/>
+      <w:bookmarkStart w:id="2" w:name="_Toc244457195"/>
       <w:r>
         <w:rPr>
           <w:rFonts w:ascii="Calibri" w:hAnsi="Calibri"/>
@@ -1256,7 +1256,7 @@
           <w:bottom w:val="single" w:sz="8" w:space="3" w:color="DBEAFE"/>
         </w:pBdr>
       </w:pPr>
-      <w:bookmarkStart w:id="3" w:name="_Toc244455909"/>
+      <w:bookmarkStart w:id="3" w:name="_Toc244457196"/>
       <w:r>
         <w:rPr>
           <w:rFonts w:ascii="Calibri" w:hAnsi="Calibri"/>
@@ -1347,7 +1347,7 @@
       <w:r>
         <w:fldChar w:fldCharType="separate"/>
       </w:r>
-      <w:hyperlink w:anchor="_Toc244455906" w:history="1">
+      <w:hyperlink w:anchor="_Toc244457193" w:history="1">
         <w:r>
           <w:rPr>
             <w:rStyle w:val="Hyperlink"/>
@@ -1374,7 +1374,7 @@
             <w:noProof/>
             <w:webHidden/>
           </w:rPr>
-          <w:instrText xml:space="preserve"> PAGEREF _Toc244455906 \h </w:instrText>
+          <w:instrText xml:space="preserve"> PAGEREF _Toc244457193 \h </w:instrText>
         </w:r>
         <w:r>
           <w:rPr>
@@ -1422,7 +1422,7 @@
           <w14:ligatures w14:val="standardContextual"/>
         </w:rPr>
       </w:pPr>
-      <w:hyperlink w:anchor="_Toc244455907" w:history="1">
+      <w:hyperlink w:anchor="_Toc244457194" w:history="1">
         <w:r>
           <w:rPr>
             <w:rStyle w:val="Hyperlink"/>
@@ -1449,7 +1449,7 @@
             <w:noProof/>
             <w:webHidden/>
           </w:rPr>
-          <w:instrText xml:space="preserve"> PAGEREF _Toc244455907 \h </w:instrText>
+          <w:instrText xml:space="preserve"> PAGEREF _Toc244457194 \h </w:instrText>
         </w:r>
         <w:r>
           <w:rPr>
@@ -1497,7 +1497,7 @@
           <w14:ligatures w14:val="standardContextual"/>
         </w:rPr>
       </w:pPr>
-      <w:hyperlink w:anchor="_Toc244455908" w:history="1">
+      <w:hyperlink w:anchor="_Toc244457195" w:history="1">
         <w:r>
           <w:rPr>
             <w:rStyle w:val="Hyperlink"/>
@@ -1524,7 +1524,7 @@
             <w:noProof/>
             <w:webHidden/>
           </w:rPr>
-          <w:instrText xml:space="preserve"> PAGEREF _Toc244455908 \h </w:instrText>
+          <w:instrText xml:space="preserve"> PAGEREF _Toc244457195 \h </w:instrText>
         </w:r>
         <w:r>
           <w:rPr>
@@ -1572,7 +1572,7 @@
           <w14:ligatures w14:val="standardContextual"/>
         </w:rPr>
       </w:pPr>
-      <w:hyperlink w:anchor="_Toc244455909" w:history="1">
+      <w:hyperlink w:anchor="_Toc244457196" w:history="1">
         <w:r>
           <w:rPr>
             <w:rStyle w:val="Hyperlink"/>
@@ -1599,7 +1599,7 @@
             <w:noProof/>
             <w:webHidden/>
           </w:rPr>
-          <w:instrText xml:space="preserve"> PAGEREF _Toc244455909 \h </w:instrText>
+          <w:instrText xml:space="preserve"> PAGEREF _Toc244457196 \h </w:instrText>
         </w:r>
         <w:r>
           <w:rPr>
@@ -1647,7 +1647,7 @@
           <w14:ligatures w14:val="standardContextual"/>
         </w:rPr>
       </w:pPr>
-      <w:hyperlink w:anchor="_Toc244455910" w:history="1">
+      <w:hyperlink w:anchor="_Toc244457197" w:history="1">
         <w:r>
           <w:rPr>
             <w:rStyle w:val="Hyperlink"/>
@@ -1674,7 +1674,7 @@
             <w:noProof/>
             <w:webHidden/>
           </w:rPr>
-          <w:instrText xml:space="preserve"> PAGEREF _Toc244455910 \h </w:instrText>
+          <w:instrText xml:space="preserve"> PAGEREF _Toc244457197 \h </w:instrText>
         </w:r>
         <w:r>
           <w:rPr>
@@ -1722,7 +1722,7 @@
           <w14:ligatures w14:val="standardContextual"/>
         </w:rPr>
       </w:pPr>
-      <w:hyperlink w:anchor="_Toc244455911" w:history="1">
+      <w:hyperlink w:anchor="_Toc244457198" w:history="1">
         <w:r>
           <w:rPr>
             <w:rStyle w:val="Hyperlink"/>
@@ -1749,7 +1749,7 @@
             <w:noProof/>
             <w:webHidden/>
           </w:rPr>
-          <w:instrText xml:space="preserve"> PAGEREF _Toc244455911 \h </w:instrText>
+          <w:instrText xml:space="preserve"> PAGEREF _Toc244457198 \h </w:instrText>
         </w:r>
         <w:r>
           <w:rPr>
@@ -1797,7 +1797,7 @@
           <w14:ligatures w14:val="standardContextual"/>
         </w:rPr>
       </w:pPr>
-      <w:hyperlink w:anchor="_Toc244455912" w:history="1">
+      <w:hyperlink w:anchor="_Toc244457199" w:history="1">
         <w:r>
           <w:rPr>
             <w:rStyle w:val="Hyperlink"/>
@@ -1824,7 +1824,7 @@
             <w:noProof/>
             <w:webHidden/>
           </w:rPr>
-          <w:instrText xml:space="preserve"> PAGEREF _Toc244455912 \h </w:instrText>
+          <w:instrText xml:space="preserve"> PAGEREF _Toc244457199 \h </w:instrText>
         </w:r>
         <w:r>
           <w:rPr>
@@ -1872,7 +1872,7 @@
           <w14:ligatures w14:val="standardContextual"/>
         </w:rPr>
       </w:pPr>
-      <w:hyperlink w:anchor="_Toc244455913" w:history="1">
+      <w:hyperlink w:anchor="_Toc244457200" w:history="1">
         <w:r>
           <w:rPr>
             <w:rStyle w:val="Hyperlink"/>
@@ -1899,7 +1899,7 @@
             <w:noProof/>
             <w:webHidden/>
           </w:rPr>
-          <w:instrText xml:space="preserve"> PAGEREF _Toc244455913 \h </w:instrText>
+          <w:instrText xml:space="preserve"> PAGEREF _Toc244457200 \h </w:instrText>
         </w:r>
         <w:r>
           <w:rPr>
@@ -1947,7 +1947,7 @@
           <w14:ligatures w14:val="standardContextual"/>
         </w:rPr>
       </w:pPr>
-      <w:hyperlink w:anchor="_Toc244455914" w:history="1">
+      <w:hyperlink w:anchor="_Toc244457201" w:history="1">
         <w:r>
           <w:rPr>
             <w:rStyle w:val="Hyperlink"/>
@@ -1974,7 +1974,7 @@
             <w:noProof/>
             <w:webHidden/>
           </w:rPr>
-          <w:instrText xml:space="preserve"> PAGEREF _Toc244455914 \h </w:instrText>
+          <w:instrText xml:space="preserve"> PAGEREF _Toc244457201 \h </w:instrText>
         </w:r>
         <w:r>
           <w:rPr>
@@ -2022,7 +2022,7 @@
           <w14:ligatures w14:val="standardContextual"/>
         </w:rPr>
       </w:pPr>
-      <w:hyperlink w:anchor="_Toc244455915" w:history="1">
+      <w:hyperlink w:anchor="_Toc244457202" w:history="1">
         <w:r>
           <w:rPr>
             <w:rStyle w:val="Hyperlink"/>
@@ -2049,7 +2049,7 @@
             <w:noProof/>
             <w:webHidden/>
           </w:rPr>
-          <w:instrText xml:space="preserve"> PAGEREF _Toc244455915 \h </w:instrText>
+          <w:instrText xml:space="preserve"> PAGEREF _Toc244457202 \h </w:instrText>
         </w:r>
         <w:r>
           <w:rPr>
@@ -2097,7 +2097,7 @@
           <w14:ligatures w14:val="standardContextual"/>
         </w:rPr>
       </w:pPr>
-      <w:hyperlink w:anchor="_Toc244455916" w:history="1">
+      <w:hyperlink w:anchor="_Toc244457203" w:history="1">
         <w:r>
           <w:rPr>
             <w:rStyle w:val="Hyperlink"/>
@@ -2124,7 +2124,7 @@
             <w:noProof/>
             <w:webHidden/>
           </w:rPr>
-          <w:instrText xml:space="preserve"> PAGEREF _Toc244455916 \h </w:instrText>
+          <w:instrText xml:space="preserve"> PAGEREF _Toc244457203 \h </w:instrText>
         </w:r>
         <w:r>
           <w:rPr>
@@ -2172,7 +2172,7 @@
           <w14:ligatures w14:val="standardContextual"/>
         </w:rPr>
       </w:pPr>
-      <w:hyperlink w:anchor="_Toc244455917" w:history="1">
+      <w:hyperlink w:anchor="_Toc244457204" w:history="1">
         <w:r>
           <w:rPr>
             <w:rStyle w:val="Hyperlink"/>
@@ -2199,7 +2199,7 @@
             <w:noProof/>
             <w:webHidden/>
           </w:rPr>
-          <w:instrText xml:space="preserve"> PAGEREF _Toc244455917 \h </w:instrText>
+          <w:instrText xml:space="preserve"> PAGEREF _Toc244457204 \h </w:instrText>
         </w:r>
         <w:r>
           <w:rPr>
@@ -2247,7 +2247,7 @@
           <w14:ligatures w14:val="standardContextual"/>
         </w:rPr>
       </w:pPr>
-      <w:hyperlink w:anchor="_Toc244455918" w:history="1">
+      <w:hyperlink w:anchor="_Toc244457205" w:history="1">
         <w:r>
           <w:rPr>
             <w:rStyle w:val="Hyperlink"/>
@@ -2274,7 +2274,7 @@
             <w:noProof/>
             <w:webHidden/>
           </w:rPr>
-          <w:instrText xml:space="preserve"> PAGEREF _Toc244455918 \h </w:instrText>
+          <w:instrText xml:space="preserve"> PAGEREF _Toc244457205 \h </w:instrText>
         </w:r>
         <w:r>
           <w:rPr>
@@ -2322,7 +2322,7 @@
           <w14:ligatures w14:val="standardContextual"/>
         </w:rPr>
       </w:pPr>
-      <w:hyperlink w:anchor="_Toc244455919" w:history="1">
+      <w:hyperlink w:anchor="_Toc244457206" w:history="1">
         <w:r>
           <w:rPr>
             <w:rStyle w:val="Hyperlink"/>
@@ -2349,7 +2349,7 @@
             <w:noProof/>
             <w:webHidden/>
           </w:rPr>
-          <w:instrText xml:space="preserve"> PAGEREF _Toc244455919 \h </w:instrText>
+          <w:instrText xml:space="preserve"> PAGEREF _Toc244457206 \h </w:instrText>
         </w:r>
         <w:r>
           <w:rPr>
@@ -2397,7 +2397,7 @@
           <w14:ligatures w14:val="standardContextual"/>
         </w:rPr>
       </w:pPr>
-      <w:hyperlink w:anchor="_Toc244455920" w:history="1">
+      <w:hyperlink w:anchor="_Toc244457207" w:history="1">
         <w:r>
           <w:rPr>
             <w:rStyle w:val="Hyperlink"/>
@@ -2424,7 +2424,7 @@
             <w:noProof/>
             <w:webHidden/>
           </w:rPr>
-          <w:instrText xml:space="preserve"> PAGEREF _Toc244455920 \h </w:instrText>
+          <w:instrText xml:space="preserve"> PAGEREF _Toc244457207 \h </w:instrText>
         </w:r>
         <w:r>
           <w:rPr>
@@ -2472,7 +2472,7 @@
           <w14:ligatures w14:val="standardContextual"/>
         </w:rPr>
       </w:pPr>
-      <w:hyperlink w:anchor="_Toc244455921" w:history="1">
+      <w:hyperlink w:anchor="_Toc244457208" w:history="1">
         <w:r>
           <w:rPr>
             <w:rStyle w:val="Hyperlink"/>
@@ -2499,7 +2499,7 @@
             <w:noProof/>
             <w:webHidden/>
           </w:rPr>
-          <w:instrText xml:space="preserve"> PAGEREF _Toc244455921 \h </w:instrText>
+          <w:instrText xml:space="preserve"> PAGEREF _Toc244457208 \h </w:instrText>
         </w:r>
         <w:r>
           <w:rPr>
@@ -2547,7 +2547,7 @@
           <w14:ligatures w14:val="standardContextual"/>
         </w:rPr>
       </w:pPr>
-      <w:hyperlink w:anchor="_Toc244455922" w:history="1">
+      <w:hyperlink w:anchor="_Toc244457209" w:history="1">
         <w:r>
           <w:rPr>
             <w:rStyle w:val="Hyperlink"/>
@@ -2574,7 +2574,7 @@
             <w:noProof/>
             <w:webHidden/>
           </w:rPr>
-          <w:instrText xml:space="preserve"> PAGEREF _Toc244455922 \h </w:instrText>
+          <w:instrText xml:space="preserve"> PAGEREF _Toc244457209 \h </w:instrText>
         </w:r>
         <w:r>
           <w:rPr>
@@ -2622,7 +2622,7 @@
           <w14:ligatures w14:val="standardContextual"/>
         </w:rPr>
       </w:pPr>
-      <w:hyperlink w:anchor="_Toc244455923" w:history="1">
+      <w:hyperlink w:anchor="_Toc244457210" w:history="1">
         <w:r>
           <w:rPr>
             <w:rStyle w:val="Hyperlink"/>
@@ -2649,7 +2649,7 @@
             <w:noProof/>
             <w:webHidden/>
           </w:rPr>
-          <w:instrText xml:space="preserve"> PAGEREF _Toc244455923 \h </w:instrText>
+          <w:instrText xml:space="preserve"> PAGEREF _Toc244457210 \h </w:instrText>
         </w:r>
         <w:r>
           <w:rPr>
@@ -2697,7 +2697,7 @@
           <w14:ligatures w14:val="standardContextual"/>
         </w:rPr>
       </w:pPr>
-      <w:hyperlink w:anchor="_Toc244455924" w:history="1">
+      <w:hyperlink w:anchor="_Toc244457211" w:history="1">
         <w:r>
           <w:rPr>
             <w:rStyle w:val="Hyperlink"/>
@@ -2724,7 +2724,7 @@
             <w:noProof/>
             <w:webHidden/>
           </w:rPr>
-          <w:instrText xml:space="preserve"> PAGEREF _Toc244455924 \h </w:instrText>
+          <w:instrText xml:space="preserve"> PAGEREF _Toc244457211 \h </w:instrText>
         </w:r>
         <w:r>
           <w:rPr>
@@ -2772,7 +2772,7 @@
           <w14:ligatures w14:val="standardContextual"/>
         </w:rPr>
       </w:pPr>
-      <w:hyperlink w:anchor="_Toc244455925" w:history="1">
+      <w:hyperlink w:anchor="_Toc244457212" w:history="1">
         <w:r>
           <w:rPr>
             <w:rStyle w:val="Hyperlink"/>
@@ -2799,7 +2799,7 @@
             <w:noProof/>
             <w:webHidden/>
           </w:rPr>
-          <w:instrText xml:space="preserve"> PAGEREF _Toc244455925 \h </w:instrText>
+          <w:instrText xml:space="preserve"> PAGEREF _Toc244457212 \h </w:instrText>
         </w:r>
         <w:r>
           <w:rPr>
@@ -2847,7 +2847,7 @@
           <w14:ligatures w14:val="standardContextual"/>
         </w:rPr>
       </w:pPr>
-      <w:hyperlink w:anchor="_Toc244455926" w:history="1">
+      <w:hyperlink w:anchor="_Toc244457213" w:history="1">
         <w:r>
           <w:rPr>
             <w:rStyle w:val="Hyperlink"/>
@@ -2874,7 +2874,7 @@
             <w:noProof/>
             <w:webHidden/>
           </w:rPr>
-          <w:instrText xml:space="preserve"> PAGEREF _Toc244455926 \h </w:instrText>
+          <w:instrText xml:space="preserve"> PAGEREF _Toc244457213 \h </w:instrText>
         </w:r>
         <w:r>
           <w:rPr>
@@ -2922,7 +2922,7 @@
           <w14:ligatures w14:val="standardContextual"/>
         </w:rPr>
       </w:pPr>
-      <w:hyperlink w:anchor="_Toc244455927" w:history="1">
+      <w:hyperlink w:anchor="_Toc244457214" w:history="1">
         <w:r>
           <w:rPr>
             <w:rStyle w:val="Hyperlink"/>
@@ -2949,7 +2949,7 @@
             <w:noProof/>
             <w:webHidden/>
           </w:rPr>
-          <w:instrText xml:space="preserve"> PAGEREF _Toc244455927 \h </w:instrText>
+          <w:instrText xml:space="preserve"> PAGEREF _Toc244457214 \h </w:instrText>
         </w:r>
         <w:r>
           <w:rPr>
@@ -2997,7 +2997,7 @@
           <w14:ligatures w14:val="standardContextual"/>
         </w:rPr>
       </w:pPr>
-      <w:hyperlink w:anchor="_Toc244455928" w:history="1">
+      <w:hyperlink w:anchor="_Toc244457215" w:history="1">
         <w:r>
           <w:rPr>
             <w:rStyle w:val="Hyperlink"/>
@@ -3024,7 +3024,7 @@
             <w:noProof/>
             <w:webHidden/>
           </w:rPr>
-          <w:instrText xml:space="preserve"> PAGEREF _Toc244455928 \h </w:instrText>
+          <w:instrText xml:space="preserve"> PAGEREF _Toc244457215 \h </w:instrText>
         </w:r>
         <w:r>
           <w:rPr>
@@ -3072,7 +3072,7 @@
           <w14:ligatures w14:val="standardContextual"/>
         </w:rPr>
       </w:pPr>
-      <w:hyperlink w:anchor="_Toc244455929" w:history="1">
+      <w:hyperlink w:anchor="_Toc244457216" w:history="1">
         <w:r>
           <w:rPr>
             <w:rStyle w:val="Hyperlink"/>
@@ -3099,7 +3099,7 @@
             <w:noProof/>
             <w:webHidden/>
           </w:rPr>
-          <w:instrText xml:space="preserve"> PAGEREF _Toc244455929 \h </w:instrText>
+          <w:instrText xml:space="preserve"> PAGEREF _Toc244457216 \h </w:instrText>
         </w:r>
         <w:r>
           <w:rPr>
@@ -3147,7 +3147,7 @@
           <w14:ligatures w14:val="standardContextual"/>
         </w:rPr>
       </w:pPr>
-      <w:hyperlink w:anchor="_Toc244455930" w:history="1">
+      <w:hyperlink w:anchor="_Toc244457217" w:history="1">
         <w:r>
           <w:rPr>
             <w:rStyle w:val="Hyperlink"/>
@@ -3174,7 +3174,7 @@
             <w:noProof/>
             <w:webHidden/>
           </w:rPr>
-          <w:instrText xml:space="preserve"> PAGEREF _Toc244455930 \h </w:instrText>
+          <w:instrText xml:space="preserve"> PAGEREF _Toc244457217 \h </w:instrText>
         </w:r>
         <w:r>
           <w:rPr>
@@ -3222,7 +3222,7 @@
           <w14:ligatures w14:val="standardContextual"/>
         </w:rPr>
       </w:pPr>
-      <w:hyperlink w:anchor="_Toc244455931" w:history="1">
+      <w:hyperlink w:anchor="_Toc244457218" w:history="1">
         <w:r>
           <w:rPr>
             <w:rStyle w:val="Hyperlink"/>
@@ -3249,7 +3249,7 @@
             <w:noProof/>
             <w:webHidden/>
           </w:rPr>
-          <w:instrText xml:space="preserve"> PAGEREF _Toc244455931 \h </w:instrText>
+          <w:instrText xml:space="preserve"> PAGEREF _Toc244457218 \h </w:instrText>
         </w:r>
         <w:r>
           <w:rPr>
@@ -3297,7 +3297,7 @@
           <w14:ligatures w14:val="standardContextual"/>
         </w:rPr>
       </w:pPr>
-      <w:hyperlink w:anchor="_Toc244455932" w:history="1">
+      <w:hyperlink w:anchor="_Toc244457219" w:history="1">
         <w:r>
           <w:rPr>
             <w:rStyle w:val="Hyperlink"/>
@@ -3324,7 +3324,7 @@
             <w:noProof/>
             <w:webHidden/>
           </w:rPr>
-          <w:instrText xml:space="preserve"> PAGEREF _Toc244455932 \h </w:instrText>
+          <w:instrText xml:space="preserve"> PAGEREF _Toc244457219 \h </w:instrText>
         </w:r>
         <w:r>
           <w:rPr>
@@ -3372,7 +3372,7 @@
           <w14:ligatures w14:val="standardContextual"/>
         </w:rPr>
       </w:pPr>
-      <w:hyperlink w:anchor="_Toc244455933" w:history="1">
+      <w:hyperlink w:anchor="_Toc244457220" w:history="1">
         <w:r>
           <w:rPr>
             <w:rStyle w:val="Hyperlink"/>
@@ -3399,7 +3399,7 @@
             <w:noProof/>
             <w:webHidden/>
           </w:rPr>
-          <w:instrText xml:space="preserve"> PAGEREF _Toc244455933 \h </w:instrText>
+          <w:instrText xml:space="preserve"> PAGEREF _Toc244457220 \h </w:instrText>
         </w:r>
         <w:r>
           <w:rPr>
@@ -3447,7 +3447,7 @@
           <w14:ligatures w14:val="standardContextual"/>
         </w:rPr>
       </w:pPr>
-      <w:hyperlink w:anchor="_Toc244455934" w:history="1">
+      <w:hyperlink w:anchor="_Toc244457221" w:history="1">
         <w:r>
           <w:rPr>
             <w:rStyle w:val="Hyperlink"/>
@@ -3474,7 +3474,7 @@
             <w:noProof/>
             <w:webHidden/>
           </w:rPr>
-          <w:instrText xml:space="preserve"> PAGEREF _Toc244455934 \h </w:instrText>
+          <w:instrText xml:space="preserve"> PAGEREF _Toc244457221 \h </w:instrText>
         </w:r>
         <w:r>
           <w:rPr>
@@ -3522,7 +3522,7 @@
           <w14:ligatures w14:val="standardContextual"/>
         </w:rPr>
       </w:pPr>
-      <w:hyperlink w:anchor="_Toc244455935" w:history="1">
+      <w:hyperlink w:anchor="_Toc244457222" w:history="1">
         <w:r>
           <w:rPr>
             <w:rStyle w:val="Hyperlink"/>
@@ -3549,7 +3549,7 @@
             <w:noProof/>
             <w:webHidden/>
           </w:rPr>
-          <w:instrText xml:space="preserve"> PAGEREF _Toc244455935 \h </w:instrText>
+          <w:instrText xml:space="preserve"> PAGEREF _Toc244457222 \h </w:instrText>
         </w:r>
         <w:r>
           <w:rPr>
@@ -3597,7 +3597,7 @@
           <w14:ligatures w14:val="standardContextual"/>
         </w:rPr>
       </w:pPr>
-      <w:hyperlink w:anchor="_Toc244455936" w:history="1">
+      <w:hyperlink w:anchor="_Toc244457223" w:history="1">
         <w:r>
           <w:rPr>
             <w:rStyle w:val="Hyperlink"/>
@@ -3624,7 +3624,7 @@
             <w:noProof/>
             <w:webHidden/>
           </w:rPr>
-          <w:instrText xml:space="preserve"> PAGEREF _Toc244455936 \h </w:instrText>
+          <w:instrText xml:space="preserve"> PAGEREF _Toc244457223 \h </w:instrText>
         </w:r>
         <w:r>
           <w:rPr>
@@ -3672,7 +3672,7 @@
           <w14:ligatures w14:val="standardContextual"/>
         </w:rPr>
       </w:pPr>
-      <w:hyperlink w:anchor="_Toc244455937" w:history="1">
+      <w:hyperlink w:anchor="_Toc244457224" w:history="1">
         <w:r>
           <w:rPr>
             <w:rStyle w:val="Hyperlink"/>
@@ -3699,7 +3699,7 @@
             <w:noProof/>
             <w:webHidden/>
           </w:rPr>
-          <w:instrText xml:space="preserve"> PAGEREF _Toc244455937 \h </w:instrText>
+          <w:instrText xml:space="preserve"> PAGEREF _Toc244457224 \h </w:instrText>
         </w:r>
         <w:r>
           <w:rPr>
@@ -3747,7 +3747,7 @@
           <w14:ligatures w14:val="standardContextual"/>
         </w:rPr>
       </w:pPr>
-      <w:hyperlink w:anchor="_Toc244455938" w:history="1">
+      <w:hyperlink w:anchor="_Toc244457225" w:history="1">
         <w:r>
           <w:rPr>
             <w:rStyle w:val="Hyperlink"/>
@@ -3774,7 +3774,7 @@
             <w:noProof/>
             <w:webHidden/>
           </w:rPr>
-          <w:instrText xml:space="preserve"> PAGEREF _Toc244455938 \h </w:instrText>
+          <w:instrText xml:space="preserve"> PAGEREF _Toc244457225 \h </w:instrText>
         </w:r>
         <w:r>
           <w:rPr>
@@ -3822,7 +3822,7 @@
           <w14:ligatures w14:val="standardContextual"/>
         </w:rPr>
       </w:pPr>
-      <w:hyperlink w:anchor="_Toc244455939" w:history="1">
+      <w:hyperlink w:anchor="_Toc244457226" w:history="1">
         <w:r>
           <w:rPr>
             <w:rStyle w:val="Hyperlink"/>
@@ -3849,7 +3849,7 @@
             <w:noProof/>
             <w:webHidden/>
           </w:rPr>
-          <w:instrText xml:space="preserve"> PAGEREF _Toc244455939 \h </w:instrText>
+          <w:instrText xml:space="preserve"> PAGEREF _Toc244457226 \h </w:instrText>
         </w:r>
         <w:r>
           <w:rPr>
@@ -3897,7 +3897,7 @@
           <w14:ligatures w14:val="standardContextual"/>
         </w:rPr>
       </w:pPr>
-      <w:hyperlink w:anchor="_Toc244455940" w:history="1">
+      <w:hyperlink w:anchor="_Toc244457227" w:history="1">
         <w:r>
           <w:rPr>
             <w:rStyle w:val="Hyperlink"/>
@@ -3924,7 +3924,7 @@
             <w:noProof/>
             <w:webHidden/>
           </w:rPr>
-          <w:instrText xml:space="preserve"> PAGEREF _Toc244455940 \h </w:instrText>
+          <w:instrText xml:space="preserve"> PAGEREF _Toc244457227 \h </w:instrText>
         </w:r>
         <w:r>
           <w:rPr>
@@ -3972,7 +3972,7 @@
           <w14:ligatures w14:val="standardContextual"/>
         </w:rPr>
       </w:pPr>
-      <w:hyperlink w:anchor="_Toc244455941" w:history="1">
+      <w:hyperlink w:anchor="_Toc244457228" w:history="1">
         <w:r>
           <w:rPr>
             <w:rStyle w:val="Hyperlink"/>
@@ -3999,7 +3999,7 @@
             <w:noProof/>
             <w:webHidden/>
           </w:rPr>
-          <w:instrText xml:space="preserve"> PAGEREF _Toc244455941 \h </w:instrText>
+          <w:instrText xml:space="preserve"> PAGEREF _Toc244457228 \h </w:instrText>
         </w:r>
         <w:r>
           <w:rPr>
@@ -4047,7 +4047,7 @@
           <w14:ligatures w14:val="standardContextual"/>
         </w:rPr>
       </w:pPr>
-      <w:hyperlink w:anchor="_Toc244455942" w:history="1">
+      <w:hyperlink w:anchor="_Toc244457229" w:history="1">
         <w:r>
           <w:rPr>
             <w:rStyle w:val="Hyperlink"/>
@@ -4074,7 +4074,7 @@
             <w:noProof/>
             <w:webHidden/>
           </w:rPr>
-          <w:instrText xml:space="preserve"> PAGEREF _Toc244455942 \h </w:instrText>
+          <w:instrText xml:space="preserve"> PAGEREF _Toc244457229 \h </w:instrText>
         </w:r>
         <w:r>
           <w:rPr>
@@ -4122,7 +4122,7 @@
           <w14:ligatures w14:val="standardContextual"/>
         </w:rPr>
       </w:pPr>
-      <w:hyperlink w:anchor="_Toc244455943" w:history="1">
+      <w:hyperlink w:anchor="_Toc244457230" w:history="1">
         <w:r>
           <w:rPr>
             <w:rStyle w:val="Hyperlink"/>
@@ -4149,7 +4149,7 @@
             <w:noProof/>
             <w:webHidden/>
           </w:rPr>
-          <w:instrText xml:space="preserve"> PAGEREF _Toc244455943 \h </w:instrText>
+          <w:instrText xml:space="preserve"> PAGEREF _Toc244457230 \h </w:instrText>
         </w:r>
         <w:r>
           <w:rPr>
@@ -4197,7 +4197,7 @@
           <w14:ligatures w14:val="standardContextual"/>
         </w:rPr>
       </w:pPr>
-      <w:hyperlink w:anchor="_Toc244455944" w:history="1">
+      <w:hyperlink w:anchor="_Toc244457231" w:history="1">
         <w:r>
           <w:rPr>
             <w:rStyle w:val="Hyperlink"/>
@@ -4224,7 +4224,7 @@
             <w:noProof/>
             <w:webHidden/>
           </w:rPr>
-          <w:instrText xml:space="preserve"> PAGEREF _Toc244455944 \h </w:instrText>
+          <w:instrText xml:space="preserve"> PAGEREF _Toc244457231 \h </w:instrText>
         </w:r>
         <w:r>
           <w:rPr>
@@ -4272,7 +4272,7 @@
           <w14:ligatures w14:val="standardContextual"/>
         </w:rPr>
       </w:pPr>
-      <w:hyperlink w:anchor="_Toc244455945" w:history="1">
+      <w:hyperlink w:anchor="_Toc244457232" w:history="1">
         <w:r>
           <w:rPr>
             <w:rStyle w:val="Hyperlink"/>
@@ -4299,7 +4299,7 @@
             <w:noProof/>
             <w:webHidden/>
           </w:rPr>
-          <w:instrText xml:space="preserve"> PAGEREF _Toc244455945 \h </w:instrText>
+          <w:instrText xml:space="preserve"> PAGEREF _Toc244457232 \h </w:instrText>
         </w:r>
         <w:r>
           <w:rPr>
@@ -4347,7 +4347,7 @@
           <w14:ligatures w14:val="standardContextual"/>
         </w:rPr>
       </w:pPr>
-      <w:hyperlink w:anchor="_Toc244455946" w:history="1">
+      <w:hyperlink w:anchor="_Toc244457233" w:history="1">
         <w:r>
           <w:rPr>
             <w:rStyle w:val="Hyperlink"/>
@@ -4374,7 +4374,7 @@
             <w:noProof/>
             <w:webHidden/>
           </w:rPr>
-          <w:instrText xml:space="preserve"> PAGEREF _Toc244455946 \h </w:instrText>
+          <w:instrText xml:space="preserve"> PAGEREF _Toc244457233 \h </w:instrText>
         </w:r>
         <w:r>
           <w:rPr>
@@ -4422,7 +4422,7 @@
           <w14:ligatures w14:val="standardContextual"/>
         </w:rPr>
       </w:pPr>
-      <w:hyperlink w:anchor="_Toc244455947" w:history="1">
+      <w:hyperlink w:anchor="_Toc244457234" w:history="1">
         <w:r>
           <w:rPr>
             <w:rStyle w:val="Hyperlink"/>
@@ -4449,7 +4449,7 @@
             <w:noProof/>
             <w:webHidden/>
           </w:rPr>
-          <w:instrText xml:space="preserve"> PAGEREF _Toc244455947 \h </w:instrText>
+          <w:instrText xml:space="preserve"> PAGEREF _Toc244457234 \h </w:instrText>
         </w:r>
         <w:r>
           <w:rPr>
@@ -4497,7 +4497,7 @@
           <w14:ligatures w14:val="standardContextual"/>
         </w:rPr>
       </w:pPr>
-      <w:hyperlink w:anchor="_Toc244455948" w:history="1">
+      <w:hyperlink w:anchor="_Toc244457235" w:history="1">
         <w:r>
           <w:rPr>
             <w:rStyle w:val="Hyperlink"/>
@@ -4524,7 +4524,7 @@
             <w:noProof/>
             <w:webHidden/>
           </w:rPr>
-          <w:instrText xml:space="preserve"> PAGEREF _Toc244455948 \h </w:instrText>
+          <w:instrText xml:space="preserve"> PAGEREF _Toc244457235 \h </w:instrText>
         </w:r>
         <w:r>
           <w:rPr>
@@ -4572,7 +4572,7 @@
           <w14:ligatures w14:val="standardContextual"/>
         </w:rPr>
       </w:pPr>
-      <w:hyperlink w:anchor="_Toc244455949" w:history="1">
+      <w:hyperlink w:anchor="_Toc244457236" w:history="1">
         <w:r>
           <w:rPr>
             <w:rStyle w:val="Hyperlink"/>
@@ -4599,7 +4599,7 @@
             <w:noProof/>
             <w:webHidden/>
           </w:rPr>
-          <w:instrText xml:space="preserve"> PAGEREF _Toc244455949 \h </w:instrText>
+          <w:instrText xml:space="preserve"> PAGEREF _Toc244457236 \h </w:instrText>
         </w:r>
         <w:r>
           <w:rPr>
@@ -4647,7 +4647,7 @@
           <w14:ligatures w14:val="standardContextual"/>
         </w:rPr>
       </w:pPr>
-      <w:hyperlink w:anchor="_Toc244455950" w:history="1">
+      <w:hyperlink w:anchor="_Toc244457237" w:history="1">
         <w:r>
           <w:rPr>
             <w:rStyle w:val="Hyperlink"/>
@@ -4674,7 +4674,7 @@
             <w:noProof/>
             <w:webHidden/>
           </w:rPr>
-          <w:instrText xml:space="preserve"> PAGEREF _Toc244455950 \h </w:instrText>
+          <w:instrText xml:space="preserve"> PAGEREF _Toc244457237 \h </w:instrText>
         </w:r>
         <w:r>
           <w:rPr>
@@ -4722,7 +4722,7 @@
           <w14:ligatures w14:val="standardContextual"/>
         </w:rPr>
       </w:pPr>
-      <w:hyperlink w:anchor="_Toc244455951" w:history="1">
+      <w:hyperlink w:anchor="_Toc244457238" w:history="1">
         <w:r>
           <w:rPr>
             <w:rStyle w:val="Hyperlink"/>
@@ -4749,7 +4749,7 @@
             <w:noProof/>
             <w:webHidden/>
           </w:rPr>
-          <w:instrText xml:space="preserve"> PAGEREF _Toc244455951 \h </w:instrText>
+          <w:instrText xml:space="preserve"> PAGEREF _Toc244457238 \h </w:instrText>
         </w:r>
         <w:r>
           <w:rPr>
@@ -4797,7 +4797,7 @@
           <w14:ligatures w14:val="standardContextual"/>
         </w:rPr>
       </w:pPr>
-      <w:hyperlink w:anchor="_Toc244455952" w:history="1">
+      <w:hyperlink w:anchor="_Toc244457239" w:history="1">
         <w:r>
           <w:rPr>
             <w:rStyle w:val="Hyperlink"/>
@@ -4824,7 +4824,7 @@
             <w:noProof/>
             <w:webHidden/>
           </w:rPr>
-          <w:instrText xml:space="preserve"> PAGEREF _Toc244455952 \h </w:instrText>
+          <w:instrText xml:space="preserve"> PAGEREF _Toc244457239 \h </w:instrText>
         </w:r>
         <w:r>
           <w:rPr>
@@ -4872,7 +4872,7 @@
           <w14:ligatures w14:val="standardContextual"/>
         </w:rPr>
       </w:pPr>
-      <w:hyperlink w:anchor="_Toc244455953" w:history="1">
+      <w:hyperlink w:anchor="_Toc244457240" w:history="1">
         <w:r>
           <w:rPr>
             <w:rStyle w:val="Hyperlink"/>
@@ -4899,7 +4899,7 @@
             <w:noProof/>
             <w:webHidden/>
           </w:rPr>
-          <w:instrText xml:space="preserve"> PAGEREF _Toc244455953 \h </w:instrText>
+          <w:instrText xml:space="preserve"> PAGEREF _Toc244457240 \h </w:instrText>
         </w:r>
         <w:r>
           <w:rPr>
@@ -4947,7 +4947,7 @@
           <w14:ligatures w14:val="standardContextual"/>
         </w:rPr>
       </w:pPr>
-      <w:hyperlink w:anchor="_Toc244455954" w:history="1">
+      <w:hyperlink w:anchor="_Toc244457241" w:history="1">
         <w:r>
           <w:rPr>
             <w:rStyle w:val="Hyperlink"/>
@@ -4974,7 +4974,7 @@
             <w:noProof/>
             <w:webHidden/>
           </w:rPr>
-          <w:instrText xml:space="preserve"> PAGEREF _Toc244455954 \h </w:instrText>
+          <w:instrText xml:space="preserve"> PAGEREF _Toc244457241 \h </w:instrText>
         </w:r>
         <w:r>
           <w:rPr>
@@ -5022,7 +5022,7 @@
           <w14:ligatures w14:val="standardContextual"/>
         </w:rPr>
       </w:pPr>
-      <w:hyperlink w:anchor="_Toc244455955" w:history="1">
+      <w:hyperlink w:anchor="_Toc244457242" w:history="1">
         <w:r>
           <w:rPr>
             <w:rStyle w:val="Hyperlink"/>
@@ -5049,7 +5049,7 @@
             <w:noProof/>
             <w:webHidden/>
           </w:rPr>
-          <w:instrText xml:space="preserve"> PAGEREF _Toc244455955 \h </w:instrText>
+          <w:instrText xml:space="preserve"> PAGEREF _Toc244457242 \h </w:instrText>
         </w:r>
         <w:r>
           <w:rPr>
@@ -5097,7 +5097,7 @@
           <w14:ligatures w14:val="standardContextual"/>
         </w:rPr>
       </w:pPr>
-      <w:hyperlink w:anchor="_Toc244455956" w:history="1">
+      <w:hyperlink w:anchor="_Toc244457243" w:history="1">
         <w:r>
           <w:rPr>
             <w:rStyle w:val="Hyperlink"/>
@@ -5124,7 +5124,7 @@
             <w:noProof/>
             <w:webHidden/>
           </w:rPr>
-          <w:instrText xml:space="preserve"> PAGEREF _Toc244455956 \h </w:instrText>
+          <w:instrText xml:space="preserve"> PAGEREF _Toc244457243 \h </w:instrText>
         </w:r>
         <w:r>
           <w:rPr>
@@ -5172,7 +5172,7 @@
           <w14:ligatures w14:val="standardContextual"/>
         </w:rPr>
       </w:pPr>
-      <w:hyperlink w:anchor="_Toc244455957" w:history="1">
+      <w:hyperlink w:anchor="_Toc244457244" w:history="1">
         <w:r>
           <w:rPr>
             <w:rStyle w:val="Hyperlink"/>
@@ -5199,7 +5199,7 @@
             <w:noProof/>
             <w:webHidden/>
           </w:rPr>
-          <w:instrText xml:space="preserve"> PAGEREF _Toc244455957 \h </w:instrText>
+          <w:instrText xml:space="preserve"> PAGEREF _Toc244457244 \h </w:instrText>
         </w:r>
         <w:r>
           <w:rPr>
@@ -5247,7 +5247,7 @@
           <w14:ligatures w14:val="standardContextual"/>
         </w:rPr>
       </w:pPr>
-      <w:hyperlink w:anchor="_Toc244455958" w:history="1">
+      <w:hyperlink w:anchor="_Toc244457245" w:history="1">
         <w:r>
           <w:rPr>
             <w:rStyle w:val="Hyperlink"/>
@@ -5274,7 +5274,7 @@
             <w:noProof/>
             <w:webHidden/>
           </w:rPr>
-          <w:instrText xml:space="preserve"> PAGEREF _Toc244455958 \h </w:instrText>
+          <w:instrText xml:space="preserve"> PAGEREF _Toc244457245 \h </w:instrText>
         </w:r>
         <w:r>
           <w:rPr>
@@ -5322,7 +5322,7 @@
           <w14:ligatures w14:val="standardContextual"/>
         </w:rPr>
       </w:pPr>
-      <w:hyperlink w:anchor="_Toc244455959" w:history="1">
+      <w:hyperlink w:anchor="_Toc244457246" w:history="1">
         <w:r>
           <w:rPr>
             <w:rStyle w:val="Hyperlink"/>
@@ -5349,7 +5349,7 @@
             <w:noProof/>
             <w:webHidden/>
           </w:rPr>
-          <w:instrText xml:space="preserve"> PAGEREF _Toc244455959 \h </w:instrText>
+          <w:instrText xml:space="preserve"> PAGEREF _Toc244457246 \h </w:instrText>
         </w:r>
         <w:r>
           <w:rPr>
@@ -5397,7 +5397,7 @@
           <w14:ligatures w14:val="standardContextual"/>
         </w:rPr>
       </w:pPr>
-      <w:hyperlink w:anchor="_Toc244455960" w:history="1">
+      <w:hyperlink w:anchor="_Toc244457247" w:history="1">
         <w:r>
           <w:rPr>
             <w:rStyle w:val="Hyperlink"/>
@@ -5424,7 +5424,7 @@
             <w:noProof/>
             <w:webHidden/>
           </w:rPr>
-          <w:instrText xml:space="preserve"> PAGEREF _Toc244455960 \h </w:instrText>
+          <w:instrText xml:space="preserve"> PAGEREF _Toc244457247 \h </w:instrText>
         </w:r>
         <w:r>
           <w:rPr>
@@ -5472,7 +5472,7 @@
           <w14:ligatures w14:val="standardContextual"/>
         </w:rPr>
       </w:pPr>
-      <w:hyperlink w:anchor="_Toc244455961" w:history="1">
+      <w:hyperlink w:anchor="_Toc244457248" w:history="1">
         <w:r>
           <w:rPr>
             <w:rStyle w:val="Hyperlink"/>
@@ -5499,7 +5499,7 @@
             <w:noProof/>
             <w:webHidden/>
           </w:rPr>
-          <w:instrText xml:space="preserve"> PAGEREF _Toc244455961 \h </w:instrText>
+          <w:instrText xml:space="preserve"> PAGEREF _Toc244457248 \h </w:instrText>
         </w:r>
         <w:r>
           <w:rPr>
@@ -5547,7 +5547,7 @@
           <w14:ligatures w14:val="standardContextual"/>
         </w:rPr>
       </w:pPr>
-      <w:hyperlink w:anchor="_Toc244455962" w:history="1">
+      <w:hyperlink w:anchor="_Toc244457249" w:history="1">
         <w:r>
           <w:rPr>
             <w:rStyle w:val="Hyperlink"/>
@@ -5574,7 +5574,7 @@
             <w:noProof/>
             <w:webHidden/>
           </w:rPr>
-          <w:instrText xml:space="preserve"> PAGEREF _Toc244455962 \h </w:instrText>
+          <w:instrText xml:space="preserve"> PAGEREF _Toc244457249 \h </w:instrText>
         </w:r>
         <w:r>
           <w:rPr>
@@ -5622,7 +5622,7 @@
           <w14:ligatures w14:val="standardContextual"/>
         </w:rPr>
       </w:pPr>
-      <w:hyperlink w:anchor="_Toc244455963" w:history="1">
+      <w:hyperlink w:anchor="_Toc244457250" w:history="1">
         <w:r>
           <w:rPr>
             <w:rStyle w:val="Hyperlink"/>
@@ -5649,7 +5649,7 @@
             <w:noProof/>
             <w:webHidden/>
           </w:rPr>
-          <w:instrText xml:space="preserve"> PAGEREF _Toc244455963 \h </w:instrText>
+          <w:instrText xml:space="preserve"> PAGEREF _Toc244457250 \h </w:instrText>
         </w:r>
         <w:r>
           <w:rPr>
@@ -5697,7 +5697,7 @@
           <w14:ligatures w14:val="standardContextual"/>
         </w:rPr>
       </w:pPr>
-      <w:hyperlink w:anchor="_Toc244455964" w:history="1">
+      <w:hyperlink w:anchor="_Toc244457251" w:history="1">
         <w:r>
           <w:rPr>
             <w:rStyle w:val="Hyperlink"/>
@@ -5724,7 +5724,7 @@
             <w:noProof/>
             <w:webHidden/>
           </w:rPr>
-          <w:instrText xml:space="preserve"> PAGEREF _Toc244455964 \h </w:instrText>
+          <w:instrText xml:space="preserve"> PAGEREF _Toc244457251 \h </w:instrText>
         </w:r>
         <w:r>
           <w:rPr>
@@ -5772,7 +5772,7 @@
           <w14:ligatures w14:val="standardContextual"/>
         </w:rPr>
       </w:pPr>
-      <w:hyperlink w:anchor="_Toc244455965" w:history="1">
+      <w:hyperlink w:anchor="_Toc244457252" w:history="1">
         <w:r>
           <w:rPr>
             <w:rStyle w:val="Hyperlink"/>
@@ -5799,7 +5799,7 @@
             <w:noProof/>
             <w:webHidden/>
           </w:rPr>
-          <w:instrText xml:space="preserve"> PAGEREF _Toc244455965 \h </w:instrText>
+          <w:instrText xml:space="preserve"> PAGEREF _Toc244457252 \h </w:instrText>
         </w:r>
         <w:r>
           <w:rPr>
@@ -5847,7 +5847,7 @@
           <w14:ligatures w14:val="standardContextual"/>
         </w:rPr>
       </w:pPr>
-      <w:hyperlink w:anchor="_Toc244455966" w:history="1">
+      <w:hyperlink w:anchor="_Toc244457253" w:history="1">
         <w:r>
           <w:rPr>
             <w:rStyle w:val="Hyperlink"/>
@@ -5874,7 +5874,7 @@
             <w:noProof/>
             <w:webHidden/>
           </w:rPr>
-          <w:instrText xml:space="preserve"> PAGEREF _Toc244455966 \h </w:instrText>
+          <w:instrText xml:space="preserve"> PAGEREF _Toc244457253 \h </w:instrText>
         </w:r>
         <w:r>
           <w:rPr>
@@ -5922,7 +5922,7 @@
           <w14:ligatures w14:val="standardContextual"/>
         </w:rPr>
       </w:pPr>
-      <w:hyperlink w:anchor="_Toc244455967" w:history="1">
+      <w:hyperlink w:anchor="_Toc244457254" w:history="1">
         <w:r>
           <w:rPr>
             <w:rStyle w:val="Hyperlink"/>
@@ -5949,7 +5949,7 @@
             <w:noProof/>
             <w:webHidden/>
           </w:rPr>
-          <w:instrText xml:space="preserve"> PAGEREF _Toc244455967 \h </w:instrText>
+          <w:instrText xml:space="preserve"> PAGEREF _Toc244457254 \h </w:instrText>
         </w:r>
         <w:r>
           <w:rPr>
@@ -5997,7 +5997,7 @@
           <w14:ligatures w14:val="standardContextual"/>
         </w:rPr>
       </w:pPr>
-      <w:hyperlink w:anchor="_Toc244455968" w:history="1">
+      <w:hyperlink w:anchor="_Toc244457255" w:history="1">
         <w:r>
           <w:rPr>
             <w:rStyle w:val="Hyperlink"/>
@@ -6024,7 +6024,7 @@
             <w:noProof/>
             <w:webHidden/>
           </w:rPr>
-          <w:instrText xml:space="preserve"> PAGEREF _Toc244455968 \h </w:instrText>
+          <w:instrText xml:space="preserve"> PAGEREF _Toc244457255 \h </w:instrText>
         </w:r>
         <w:r>
           <w:rPr>
@@ -6072,7 +6072,7 @@
           <w14:ligatures w14:val="standardContextual"/>
         </w:rPr>
       </w:pPr>
-      <w:hyperlink w:anchor="_Toc244455969" w:history="1">
+      <w:hyperlink w:anchor="_Toc244457256" w:history="1">
         <w:r>
           <w:rPr>
             <w:rStyle w:val="Hyperlink"/>
@@ -6099,7 +6099,7 @@
             <w:noProof/>
             <w:webHidden/>
           </w:rPr>
-          <w:instrText xml:space="preserve"> PAGEREF _Toc244455969 \h </w:instrText>
+          <w:instrText xml:space="preserve"> PAGEREF _Toc244457256 \h </w:instrText>
         </w:r>
         <w:r>
           <w:rPr>
@@ -6147,7 +6147,7 @@
           <w14:ligatures w14:val="standardContextual"/>
         </w:rPr>
       </w:pPr>
-      <w:hyperlink w:anchor="_Toc244455970" w:history="1">
+      <w:hyperlink w:anchor="_Toc244457257" w:history="1">
         <w:r>
           <w:rPr>
             <w:rStyle w:val="Hyperlink"/>
@@ -6174,7 +6174,7 @@
             <w:noProof/>
             <w:webHidden/>
           </w:rPr>
-          <w:instrText xml:space="preserve"> PAGEREF _Toc244455970 \h </w:instrText>
+          <w:instrText xml:space="preserve"> PAGEREF _Toc244457257 \h </w:instrText>
         </w:r>
         <w:r>
           <w:rPr>
@@ -6222,7 +6222,7 @@
           <w14:ligatures w14:val="standardContextual"/>
         </w:rPr>
       </w:pPr>
-      <w:hyperlink w:anchor="_Toc244455971" w:history="1">
+      <w:hyperlink w:anchor="_Toc244457258" w:history="1">
         <w:r>
           <w:rPr>
             <w:rStyle w:val="Hyperlink"/>
@@ -6249,7 +6249,7 @@
             <w:noProof/>
             <w:webHidden/>
           </w:rPr>
-          <w:instrText xml:space="preserve"> PAGEREF _Toc244455971 \h </w:instrText>
+          <w:instrText xml:space="preserve"> PAGEREF _Toc244457258 \h </w:instrText>
         </w:r>
         <w:r>
           <w:rPr>
@@ -6297,7 +6297,7 @@
           <w14:ligatures w14:val="standardContextual"/>
         </w:rPr>
       </w:pPr>
-      <w:hyperlink w:anchor="_Toc244455972" w:history="1">
+      <w:hyperlink w:anchor="_Toc244457259" w:history="1">
         <w:r>
           <w:rPr>
             <w:rStyle w:val="Hyperlink"/>
@@ -6324,7 +6324,7 @@
             <w:noProof/>
             <w:webHidden/>
           </w:rPr>
-          <w:instrText xml:space="preserve"> PAGEREF _Toc244455972 \h </w:instrText>
+          <w:instrText xml:space="preserve"> PAGEREF _Toc244457259 \h </w:instrText>
         </w:r>
         <w:r>
           <w:rPr>
@@ -6374,7 +6374,7 @@
         <w:lastRenderedPageBreak/>
         <w:t xml:space="preserve"> </w:t>
       </w:r>
-      <w:bookmarkStart w:id="4" w:name="_Toc244455910"/>
+      <w:bookmarkStart w:id="4" w:name="_Toc244457197"/>
       <w:r>
         <w:rPr>
           <w:rFonts w:ascii="Calibri" w:hAnsi="Calibri"/>
@@ -6402,7 +6402,7 @@
           <w:bottom w:val="single" w:sz="8" w:space="3" w:color="DBEAFE"/>
         </w:pBdr>
       </w:pPr>
-      <w:bookmarkStart w:id="5" w:name="_Toc244455911"/>
+      <w:bookmarkStart w:id="5" w:name="_Toc244457198"/>
       <w:r>
         <w:rPr>
           <w:rFonts w:ascii="Calibri" w:hAnsi="Calibri"/>
@@ -6442,7 +6442,7 @@
           <w:bottom w:val="single" w:sz="8" w:space="3" w:color="DBEAFE"/>
         </w:pBdr>
       </w:pPr>
-      <w:bookmarkStart w:id="6" w:name="_Toc244455912"/>
+      <w:bookmarkStart w:id="6" w:name="_Toc244457199"/>
       <w:r>
         <w:rPr>
           <w:rFonts w:ascii="Calibri" w:hAnsi="Calibri"/>
@@ -6794,7 +6794,7 @@
           <w:bottom w:val="single" w:sz="8" w:space="3" w:color="DBEAFE"/>
         </w:pBdr>
       </w:pPr>
-      <w:bookmarkStart w:id="7" w:name="_Toc244455913"/>
+      <w:bookmarkStart w:id="7" w:name="_Toc244457200"/>
       <w:r>
         <w:rPr>
           <w:rFonts w:ascii="Calibri" w:hAnsi="Calibri"/>
@@ -7299,7 +7299,7 @@
         <w:lastRenderedPageBreak/>
         <w:t xml:space="preserve"> </w:t>
       </w:r>
-      <w:bookmarkStart w:id="8" w:name="_Toc244455914"/>
+      <w:bookmarkStart w:id="8" w:name="_Toc244457201"/>
       <w:r>
         <w:rPr>
           <w:rFonts w:ascii="Calibri" w:hAnsi="Calibri"/>
@@ -8537,7 +8537,7 @@
           <w:bottom w:val="single" w:sz="8" w:space="3" w:color="DBEAFE"/>
         </w:pBdr>
       </w:pPr>
-      <w:bookmarkStart w:id="9" w:name="_Toc244455915"/>
+      <w:bookmarkStart w:id="9" w:name="_Toc244457202"/>
       <w:r>
         <w:rPr>
           <w:rFonts w:ascii="Calibri" w:hAnsi="Calibri"/>
@@ -8890,7 +8890,7 @@
           <w:bottom w:val="single" w:sz="8" w:space="3" w:color="DBEAFE"/>
         </w:pBdr>
       </w:pPr>
-      <w:bookmarkStart w:id="10" w:name="_Toc244455916"/>
+      <w:bookmarkStart w:id="10" w:name="_Toc244457203"/>
       <w:r>
         <w:rPr>
           <w:rFonts w:ascii="Calibri" w:hAnsi="Calibri"/>
@@ -9018,7 +9018,7 @@
           <w:bottom w:val="single" w:sz="8" w:space="3" w:color="DBEAFE"/>
         </w:pBdr>
       </w:pPr>
-      <w:bookmarkStart w:id="11" w:name="_Toc244455917"/>
+      <w:bookmarkStart w:id="11" w:name="_Toc244457204"/>
       <w:r>
         <w:rPr>
           <w:rFonts w:ascii="Calibri" w:hAnsi="Calibri"/>
@@ -9367,7 +9367,7 @@
           <w:bottom w:val="single" w:sz="8" w:space="3" w:color="DBEAFE"/>
         </w:pBdr>
       </w:pPr>
-      <w:bookmarkStart w:id="12" w:name="_Toc244455918"/>
+      <w:bookmarkStart w:id="12" w:name="_Toc244457205"/>
       <w:r>
         <w:rPr>
           <w:rFonts w:ascii="Calibri" w:hAnsi="Calibri"/>
@@ -9463,7 +9463,7 @@
         <w:lastRenderedPageBreak/>
         <w:t xml:space="preserve"> </w:t>
       </w:r>
-      <w:bookmarkStart w:id="13" w:name="_Toc244455919"/>
+      <w:bookmarkStart w:id="13" w:name="_Toc244457206"/>
       <w:r>
         <w:rPr>
           <w:rFonts w:ascii="Calibri" w:hAnsi="Calibri"/>
@@ -9491,7 +9491,7 @@
           <w:bottom w:val="single" w:sz="8" w:space="3" w:color="DBEAFE"/>
         </w:pBdr>
       </w:pPr>
-      <w:bookmarkStart w:id="14" w:name="_Toc244455920"/>
+      <w:bookmarkStart w:id="14" w:name="_Toc244457207"/>
       <w:r>
         <w:rPr>
           <w:rFonts w:ascii="Calibri" w:hAnsi="Calibri"/>
@@ -9631,7 +9631,7 @@
           <w:bottom w:val="single" w:sz="8" w:space="3" w:color="DBEAFE"/>
         </w:pBdr>
       </w:pPr>
-      <w:bookmarkStart w:id="15" w:name="_Toc244455921"/>
+      <w:bookmarkStart w:id="15" w:name="_Toc244457208"/>
       <w:r>
         <w:rPr>
           <w:rFonts w:ascii="Calibri" w:hAnsi="Calibri"/>
@@ -9964,7 +9964,7 @@
           <w:bottom w:val="single" w:sz="8" w:space="3" w:color="DBEAFE"/>
         </w:pBdr>
       </w:pPr>
-      <w:bookmarkStart w:id="16" w:name="_Toc244455922"/>
+      <w:bookmarkStart w:id="16" w:name="_Toc244457209"/>
       <w:r>
         <w:rPr>
           <w:rFonts w:ascii="Calibri" w:hAnsi="Calibri"/>
@@ -10240,7 +10240,7 @@
           <w:bottom w:val="single" w:sz="8" w:space="3" w:color="DBEAFE"/>
         </w:pBdr>
       </w:pPr>
-      <w:bookmarkStart w:id="17" w:name="_Toc244455923"/>
+      <w:bookmarkStart w:id="17" w:name="_Toc244457210"/>
       <w:r>
         <w:rPr>
           <w:rFonts w:ascii="Calibri" w:hAnsi="Calibri"/>
@@ -10326,7 +10326,7 @@
           <w:bottom w:val="single" w:sz="8" w:space="3" w:color="DBEAFE"/>
         </w:pBdr>
       </w:pPr>
-      <w:bookmarkStart w:id="18" w:name="_Toc244455924"/>
+      <w:bookmarkStart w:id="18" w:name="_Toc244457211"/>
       <w:r>
         <w:rPr>
           <w:rFonts w:ascii="Calibri" w:hAnsi="Calibri"/>
@@ -10433,7 +10433,7 @@
           <w:bottom w:val="single" w:sz="8" w:space="3" w:color="DBEAFE"/>
         </w:pBdr>
       </w:pPr>
-      <w:bookmarkStart w:id="19" w:name="_Toc244455925"/>
+      <w:bookmarkStart w:id="19" w:name="_Toc244457212"/>
       <w:r>
         <w:rPr>
           <w:rFonts w:ascii="Calibri" w:hAnsi="Calibri"/>
@@ -10510,7 +10510,7 @@
           <w:bottom w:val="single" w:sz="8" w:space="3" w:color="DBEAFE"/>
         </w:pBdr>
       </w:pPr>
-      <w:bookmarkStart w:id="20" w:name="_Toc244455926"/>
+      <w:bookmarkStart w:id="20" w:name="_Toc244457213"/>
       <w:r>
         <w:rPr>
           <w:rFonts w:ascii="Calibri" w:hAnsi="Calibri"/>
@@ -10850,7 +10850,7 @@
         <w:lastRenderedPageBreak/>
         <w:t xml:space="preserve"> </w:t>
       </w:r>
-      <w:bookmarkStart w:id="21" w:name="_Toc244455927"/>
+      <w:bookmarkStart w:id="21" w:name="_Toc244457214"/>
       <w:r>
         <w:rPr>
           <w:rFonts w:ascii="Calibri" w:hAnsi="Calibri"/>
@@ -10890,7 +10890,7 @@
         </w:rPr>
         <w:t xml:space="preserve"> </w:t>
       </w:r>
-      <w:bookmarkStart w:id="22" w:name="_Toc244455928"/>
+      <w:bookmarkStart w:id="22" w:name="_Toc244457215"/>
       <w:r>
         <w:rPr>
           <w:rFonts w:ascii="Calibri" w:hAnsi="Calibri"/>
@@ -11559,7 +11559,7 @@
         </w:rPr>
         <w:t xml:space="preserve"> </w:t>
       </w:r>
-      <w:bookmarkStart w:id="23" w:name="_Toc244455929"/>
+      <w:bookmarkStart w:id="23" w:name="_Toc244457216"/>
       <w:r>
         <w:rPr>
           <w:rFonts w:ascii="Calibri" w:hAnsi="Calibri"/>
@@ -12234,7 +12234,7 @@
         <w:lastRenderedPageBreak/>
         <w:t xml:space="preserve"> </w:t>
       </w:r>
-      <w:bookmarkStart w:id="24" w:name="_Toc244455930"/>
+      <w:bookmarkStart w:id="24" w:name="_Toc244457217"/>
       <w:r>
         <w:rPr>
           <w:rFonts w:ascii="Calibri" w:hAnsi="Calibri"/>
@@ -12842,7 +12842,7 @@
         </w:rPr>
         <w:t xml:space="preserve"> </w:t>
       </w:r>
-      <w:bookmarkStart w:id="25" w:name="_Toc244455931"/>
+      <w:bookmarkStart w:id="25" w:name="_Toc244457218"/>
       <w:r>
         <w:rPr>
           <w:rFonts w:ascii="Calibri" w:hAnsi="Calibri"/>
@@ -13434,7 +13434,7 @@
         </w:rPr>
         <w:t xml:space="preserve"> </w:t>
       </w:r>
-      <w:bookmarkStart w:id="26" w:name="_Toc244455932"/>
+      <w:bookmarkStart w:id="26" w:name="_Toc244457219"/>
       <w:r>
         <w:rPr>
           <w:rFonts w:ascii="Calibri" w:hAnsi="Calibri"/>
@@ -14043,7 +14043,7 @@
         </w:rPr>
         <w:t xml:space="preserve"> </w:t>
       </w:r>
-      <w:bookmarkStart w:id="27" w:name="_Toc244455933"/>
+      <w:bookmarkStart w:id="27" w:name="_Toc244457220"/>
       <w:r>
         <w:rPr>
           <w:rFonts w:ascii="Calibri" w:hAnsi="Calibri"/>
@@ -14713,7 +14713,7 @@
         </w:rPr>
         <w:t xml:space="preserve"> </w:t>
       </w:r>
-      <w:bookmarkStart w:id="28" w:name="_Toc244455934"/>
+      <w:bookmarkStart w:id="28" w:name="_Toc244457221"/>
       <w:r>
         <w:rPr>
           <w:rFonts w:ascii="Calibri" w:hAnsi="Calibri"/>
@@ -15349,7 +15349,7 @@
         </w:rPr>
         <w:t xml:space="preserve"> </w:t>
       </w:r>
-      <w:bookmarkStart w:id="29" w:name="_Toc244455935"/>
+      <w:bookmarkStart w:id="29" w:name="_Toc244457222"/>
       <w:r>
         <w:rPr>
           <w:rFonts w:ascii="Calibri" w:hAnsi="Calibri"/>
@@ -15542,7 +15542,7 @@
         <w:spacing w:after="140"/>
       </w:pPr>
       <w:r>
-        <w:t>Assembler les pièces. Avant d'appeler le modèle, Python classe la question : demande de code, date, hors-sujet, ou question documentaire. Puis il ne lui donne que les passages utiles. Enfin, il extrait les sources du texte qu'il a réellement envoyé — ce ne sont pas des remerciements, ce sont des preuves. Et si un livre volumineux est présent, Python l'a indexé page par page : la réponse peut citer « p.42 », pas seulement « le livre ».</w:t>
+        <w:t>Assembler les pièces. Avant d'appeler le modèle, Python classe la question : demande de code, date, hors-sujet, ou question documentaire. Puis il ne lui donne que les passages utiles. Enfin, il extrait les sources du texte qu'il a réellement envoyé — ce ne sont pas des remerciements, ce sont des preuves. Et si un livre volumineux est présent, Python l'a indexé page par page : la réponse peut citer « p.565 », pas seulement « le livre ».</w:t>
       </w:r>
     </w:p>
     <w:p>
@@ -16065,7 +16065,7 @@
               <w:rPr>
                 <w:sz w:val="19"/>
               </w:rPr>
-              <w:t>La garde est volontairement grossière : elle accepte dès qu'un mot important existe dans les documents ou dans le livre, même si la réponse exacte n'y est pas. Le tri par mots-clés peut choisir de mauvais passages sur une question abstraite : on améliore en ajoutant des documents, jamais en supprimant la preuve. Et on n'envoie jamais tout le corpus : même indexé, un livre de 300 pages ne pèse que quatre ou cinq pages dans le contexte.</w:t>
+              <w:t>La garde est volontairement grossière : elle accepte dès qu'un mot important existe dans les documents ou dans le livre, même si la réponse exacte n'y est pas. Le tri par mots-clés peut choisir de mauvais passages sur une question abstraite : on améliore en ajoutant des documents, jamais en supprimant la preuve. Et on n'envoie jamais tout le corpus : même indexé, un livre de 800 pages ne pèse que quatre ou cinq pages dans le contexte.</w:t>
             </w:r>
           </w:p>
         </w:tc>
@@ -16164,7 +16164,7 @@
           <w:bottom w:val="single" w:sz="8" w:space="3" w:color="DBEAFE"/>
         </w:pBdr>
       </w:pPr>
-      <w:bookmarkStart w:id="30" w:name="_Toc244455936"/>
+      <w:bookmarkStart w:id="30" w:name="_Toc244457223"/>
       <w:r>
         <w:rPr>
           <w:rFonts w:ascii="Calibri" w:hAnsi="Calibri"/>
@@ -16175,7 +16175,7 @@
     </w:p>
     <w:p>
       <w:r>
-        <w:t>Un manuel React de 300 pages pèse environ 500 000 caractères, soit seize fois la fenêtre de 8 192 tokens (≈ 30 000 caractères). On ne peut donc ni l'envoyer en entier, ni le couper aux 6 000 premiers caractères : l'agent ne connaîtrait que la préface. La solution tient dans un fichier, index_livre.py, et en quatre gestes.</w:t>
+        <w:t>Un manuel React de 800 pages pèse environ un million de caractères, soit plus de trente fois la fenêtre de 8 192 tokens (≈ 30 000 caractères). On ne peut donc ni l'envoyer en entier, ni le couper aux 6 000 premiers caractères : l'agent ne connaîtrait que la préface. La solution tient dans un fichier, index_livre.py, et en quatre gestes.</w:t>
       </w:r>
     </w:p>
     <w:p>
@@ -16232,7 +16232,7 @@
         <w:t>Envoyer</w:t>
       </w:r>
       <w:r>
-        <w:t xml:space="preserve"> — seuls les quatre ou cinq meilleurs morceaux partent au modèle, chacun précédé de [=== SOURCE: React_livre p.42 ===].</w:t>
+        <w:t xml:space="preserve"> — seuls les quatre ou cinq meilleurs morceaux partent au modèle, chacun précédé de [=== SOURCE: fullstack-react p.565 ===].</w:t>
       </w:r>
     </w:p>
     <w:p>
@@ -16246,7 +16246,7 @@
           <w:color w:val="1D4ED8"/>
           <w:sz w:val="15"/>
         </w:rPr>
-        <w:t>CE QUE LA CONSOLE AFFICHE (EXEMPLE AVEC UN LIVRE DE 312 PAGES)</w:t>
+        <w:t>CE QUE LA CONSOLE AFFICHE (LE LIVRE RÉELLEMENT DÉPOSÉ DANS COURS/LIVRES/)</w:t>
       </w:r>
     </w:p>
     <w:p>
@@ -16265,7 +16265,7 @@
           <w:color w:val="111827"/>
           <w:sz w:val="17"/>
         </w:rPr>
-        <w:t>Livre indexe : React_livre (312 pages) -&gt; 1187 morceaux, recherche BM25 par page</w:t>
+        <w:t>Livre indexe : fullstack-react (844 pages) -&gt; 1696 morceaux, citations p.X</w:t>
       </w:r>
       <w:r>
         <w:rPr>
@@ -16298,7 +16298,7 @@
           <w:sz w:val="17"/>
         </w:rPr>
         <w:br/>
-        <w:t>QUESTION : Que dit le livre sur useReducer et les etats complexes ?</w:t>
+        <w:t>QUESTION : Que dit le livre sur Redux et les reducers ?</w:t>
       </w:r>
       <w:r>
         <w:rPr>
@@ -16316,7 +16316,7 @@
           <w:sz w:val="17"/>
         </w:rPr>
         <w:br/>
-        <w:t>Le livre presente useReducer comme le hook des transitions complexes...</w:t>
+        <w:t>Un reducer est une fonction qui recoit l'etat et une action, et renvoie un nouvel etat...</w:t>
       </w:r>
       <w:r>
         <w:rPr>
@@ -16325,12 +16325,12 @@
           <w:sz w:val="17"/>
         </w:rPr>
         <w:br/>
-        <w:t>Sources consultees (preuve Python) : [React_livre p.42]  [React_livre p.43]</w:t>
-      </w:r>
-    </w:p>
-    <w:p>
-      <w:r>
-        <w:t>Le modèle voit environ 2 000 caractères, comme avant. Mais la bibliothèque peut faire 500 pages, et chaque citation porte un numéro vérifiable : on ouvre le livre à la page 42, et le passage y est. C'est la différence entre « le livre dit que » et une preuve.</w:t>
+        <w:t>Sources consultees (preuve Python) : [fullstack-react p.565]  [React-Cours-Bases p.42]</w:t>
+      </w:r>
+    </w:p>
+    <w:p>
+      <w:r>
+        <w:t>Le modèle voit environ 3 000 caractères, comme avant. Mais la bibliothèque peut faire 800 pages, et chaque citation porte un numéro vérifiable : on ouvre le livre à la page 565, et le passage y est. C'est la différence entre « le livre dit que » et une preuve.</w:t>
       </w:r>
     </w:p>
     <w:tbl>
@@ -16471,7 +16471,7 @@
               <w:rPr>
                 <w:sz w:val="17"/>
               </w:rPr>
-              <w:t>La réponse + la pastille p.42</w:t>
+              <w:t>La réponse + la pastille p.565</w:t>
             </w:r>
           </w:p>
         </w:tc>
@@ -16730,7 +16730,7 @@
         </w:rPr>
         <w:t xml:space="preserve"> </w:t>
       </w:r>
-      <w:bookmarkStart w:id="31" w:name="_Toc244455937"/>
+      <w:bookmarkStart w:id="31" w:name="_Toc244457224"/>
       <w:r>
         <w:rPr>
           <w:rFonts w:ascii="Calibri" w:hAnsi="Calibri"/>
@@ -17504,7 +17504,7 @@
         </w:rPr>
         <w:t xml:space="preserve"> </w:t>
       </w:r>
-      <w:bookmarkStart w:id="32" w:name="_Toc244455938"/>
+      <w:bookmarkStart w:id="32" w:name="_Toc244457225"/>
       <w:r>
         <w:rPr>
           <w:rFonts w:ascii="Calibri" w:hAnsi="Calibri"/>
@@ -17847,7 +17847,7 @@
           <w:color w:val="111827"/>
           <w:sz w:val="17"/>
         </w:rPr>
-        <w:t>LIVRE : React - Apprendre pas a pas (dossier du prof)</w:t>
+        <w:t>LIVRE : Le(s) livre(s) de cours/livres/ (votre copie legale)</w:t>
       </w:r>
       <w:r>
         <w:rPr>
@@ -17856,7 +17856,7 @@
           <w:sz w:val="17"/>
         </w:rPr>
         <w:br/>
-        <w:t>Fichier attendu : cours/livres/React_livre.pdf</w:t>
+        <w:t>Dossier : cours/livres/</w:t>
       </w:r>
       <w:r>
         <w:rPr>
@@ -17865,7 +17865,7 @@
           <w:sz w:val="17"/>
         </w:rPr>
         <w:br/>
-        <w:t>PDF presents : React_livre.pdf</w:t>
+        <w:t>PDF presents : fullstack-react.pdf, React-Cours-Bases.pdf</w:t>
       </w:r>
       <w:r>
         <w:rPr>
@@ -17944,7 +17944,7 @@
               <w:rPr>
                 <w:sz w:val="20"/>
               </w:rPr>
-              <w:t>L'agent peut désormais citer une page précise d'un livre et la documentation officielle, pas seulement vos notes. Un manuel de 300 pages ne rentre pas dans la fenêtre du modèle : il est indexé, et seules quatre ou cinq pages sont envoyées. Le cache, lui, rend la démonstration reproductible : si le wifi du collège tombe, ou si le CDN est bloqué, l'agent répond quand même avec ce qu'il a déjà lu.</w:t>
+              <w:t>L'agent peut désormais citer une page précise d'un livre et la documentation officielle, pas seulement vos notes. Un manuel de 800 pages ne rentre pas dans la fenêtre du modèle : il est indexé, et seules quatre ou cinq pages sont envoyées. Le cache, lui, rend la démonstration reproductible : si le wifi du collège tombe, ou si le CDN est bloqué, l'agent répond quand même avec ce qu'il a déjà lu.</w:t>
             </w:r>
           </w:p>
         </w:tc>
@@ -18157,7 +18157,7 @@
         <w:lastRenderedPageBreak/>
         <w:t xml:space="preserve"> </w:t>
       </w:r>
-      <w:bookmarkStart w:id="33" w:name="_Toc244455939"/>
+      <w:bookmarkStart w:id="33" w:name="_Toc244457226"/>
       <w:r>
         <w:rPr>
           <w:rFonts w:ascii="Calibri" w:hAnsi="Calibri"/>
@@ -18197,7 +18197,7 @@
         </w:rPr>
         <w:t xml:space="preserve"> </w:t>
       </w:r>
-      <w:bookmarkStart w:id="34" w:name="_Toc244455940"/>
+      <w:bookmarkStart w:id="34" w:name="_Toc244457227"/>
       <w:r>
         <w:rPr>
           <w:rFonts w:ascii="Calibri" w:hAnsi="Calibri"/>
@@ -18825,7 +18825,7 @@
         <w:lastRenderedPageBreak/>
         <w:t xml:space="preserve"> </w:t>
       </w:r>
-      <w:bookmarkStart w:id="35" w:name="_Toc244455941"/>
+      <w:bookmarkStart w:id="35" w:name="_Toc244457228"/>
       <w:r>
         <w:rPr>
           <w:rFonts w:ascii="Calibri" w:hAnsi="Calibri"/>
@@ -19441,7 +19441,7 @@
         </w:rPr>
         <w:t xml:space="preserve"> </w:t>
       </w:r>
-      <w:bookmarkStart w:id="36" w:name="_Toc244455942"/>
+      <w:bookmarkStart w:id="36" w:name="_Toc244457229"/>
       <w:r>
         <w:rPr>
           <w:rFonts w:ascii="Calibri" w:hAnsi="Calibri"/>
@@ -20040,7 +20040,7 @@
         <w:lastRenderedPageBreak/>
         <w:t xml:space="preserve"> </w:t>
       </w:r>
-      <w:bookmarkStart w:id="37" w:name="_Toc244455943"/>
+      <w:bookmarkStart w:id="37" w:name="_Toc244457230"/>
       <w:r>
         <w:rPr>
           <w:rFonts w:ascii="Calibri" w:hAnsi="Calibri"/>
@@ -20076,7 +20076,7 @@
           <w:bottom w:val="single" w:sz="8" w:space="3" w:color="DBEAFE"/>
         </w:pBdr>
       </w:pPr>
-      <w:bookmarkStart w:id="38" w:name="_Toc244455944"/>
+      <w:bookmarkStart w:id="38" w:name="_Toc244457231"/>
       <w:r>
         <w:rPr>
           <w:rFonts w:ascii="Calibri" w:hAnsi="Calibri"/>
@@ -20571,7 +20571,7 @@
           <w:bottom w:val="single" w:sz="8" w:space="3" w:color="DBEAFE"/>
         </w:pBdr>
       </w:pPr>
-      <w:bookmarkStart w:id="39" w:name="_Toc244455945"/>
+      <w:bookmarkStart w:id="39" w:name="_Toc244457232"/>
       <w:r>
         <w:rPr>
           <w:rFonts w:ascii="Calibri" w:hAnsi="Calibri"/>
@@ -20634,7 +20634,7 @@
           <w:bottom w:val="single" w:sz="8" w:space="3" w:color="DBEAFE"/>
         </w:pBdr>
       </w:pPr>
-      <w:bookmarkStart w:id="40" w:name="_Toc244455946"/>
+      <w:bookmarkStart w:id="40" w:name="_Toc244457233"/>
       <w:r>
         <w:rPr>
           <w:rFonts w:ascii="Calibri" w:hAnsi="Calibri"/>
@@ -21148,7 +21148,7 @@
               <w:rPr>
                 <w:sz w:val="16"/>
               </w:rPr>
-              <w:t>Que dit le livre sur useReducer ?</w:t>
+              <w:t>Que dit le livre sur Redux ?</w:t>
             </w:r>
           </w:p>
         </w:tc>
@@ -21196,7 +21196,7 @@
               <w:rPr>
                 <w:sz w:val="16"/>
               </w:rPr>
-              <w:t>React_livre p.42</w:t>
+              <w:t>fullstack-react p.565</w:t>
             </w:r>
           </w:p>
         </w:tc>
@@ -21379,7 +21379,7 @@
           <w:bottom w:val="single" w:sz="8" w:space="3" w:color="DBEAFE"/>
         </w:pBdr>
       </w:pPr>
-      <w:bookmarkStart w:id="41" w:name="_Toc244455947"/>
+      <w:bookmarkStart w:id="41" w:name="_Toc244457234"/>
       <w:r>
         <w:rPr>
           <w:rFonts w:ascii="Calibri" w:hAnsi="Calibri"/>
@@ -21660,7 +21660,7 @@
           <w:bottom w:val="single" w:sz="8" w:space="3" w:color="DBEAFE"/>
         </w:pBdr>
       </w:pPr>
-      <w:bookmarkStart w:id="42" w:name="_Toc244455948"/>
+      <w:bookmarkStart w:id="42" w:name="_Toc244457235"/>
       <w:r>
         <w:rPr>
           <w:rFonts w:ascii="Calibri" w:hAnsi="Calibri"/>
@@ -21993,7 +21993,7 @@
           <w:bottom w:val="single" w:sz="8" w:space="3" w:color="DBEAFE"/>
         </w:pBdr>
       </w:pPr>
-      <w:bookmarkStart w:id="43" w:name="_Toc244455949"/>
+      <w:bookmarkStart w:id="43" w:name="_Toc244457236"/>
       <w:r>
         <w:rPr>
           <w:rFonts w:ascii="Calibri" w:hAnsi="Calibri"/>
@@ -22385,7 +22385,7 @@
           <w:bottom w:val="single" w:sz="8" w:space="3" w:color="DBEAFE"/>
         </w:pBdr>
       </w:pPr>
-      <w:bookmarkStart w:id="44" w:name="_Toc244455950"/>
+      <w:bookmarkStart w:id="44" w:name="_Toc244457237"/>
       <w:r>
         <w:rPr>
           <w:rFonts w:ascii="Calibri" w:hAnsi="Calibri"/>
@@ -22505,7 +22505,7 @@
           <w:bottom w:val="single" w:sz="8" w:space="3" w:color="DBEAFE"/>
         </w:pBdr>
       </w:pPr>
-      <w:bookmarkStart w:id="45" w:name="_Toc244455951"/>
+      <w:bookmarkStart w:id="45" w:name="_Toc244457238"/>
       <w:r>
         <w:rPr>
           <w:rFonts w:ascii="Calibri" w:hAnsi="Calibri"/>
@@ -22587,7 +22587,7 @@
           <w:bottom w:val="single" w:sz="8" w:space="3" w:color="DBEAFE"/>
         </w:pBdr>
       </w:pPr>
-      <w:bookmarkStart w:id="46" w:name="_Toc244455952"/>
+      <w:bookmarkStart w:id="46" w:name="_Toc244457239"/>
       <w:r>
         <w:rPr>
           <w:rFonts w:ascii="Calibri" w:hAnsi="Calibri"/>
@@ -22668,7 +22668,7 @@
         <w:lastRenderedPageBreak/>
         <w:t xml:space="preserve"> </w:t>
       </w:r>
-      <w:bookmarkStart w:id="47" w:name="_Toc244455953"/>
+      <w:bookmarkStart w:id="47" w:name="_Toc244457240"/>
       <w:r>
         <w:rPr>
           <w:rFonts w:ascii="Calibri" w:hAnsi="Calibri"/>
@@ -23367,7 +23367,7 @@
           <w:bottom w:val="single" w:sz="8" w:space="3" w:color="DBEAFE"/>
         </w:pBdr>
       </w:pPr>
-      <w:bookmarkStart w:id="48" w:name="_Toc244455954"/>
+      <w:bookmarkStart w:id="48" w:name="_Toc244457241"/>
       <w:r>
         <w:rPr>
           <w:rFonts w:ascii="Calibri" w:hAnsi="Calibri"/>
@@ -23486,7 +23486,7 @@
           <w:bottom w:val="single" w:sz="8" w:space="3" w:color="DBEAFE"/>
         </w:pBdr>
       </w:pPr>
-      <w:bookmarkStart w:id="49" w:name="_Toc244455955"/>
+      <w:bookmarkStart w:id="49" w:name="_Toc244457242"/>
       <w:r>
         <w:rPr>
           <w:rFonts w:ascii="Calibri" w:hAnsi="Calibri"/>
@@ -23512,7 +23512,7 @@
           <w:bottom w:val="single" w:sz="8" w:space="3" w:color="DBEAFE"/>
         </w:pBdr>
       </w:pPr>
-      <w:bookmarkStart w:id="50" w:name="_Toc244455956"/>
+      <w:bookmarkStart w:id="50" w:name="_Toc244457243"/>
       <w:r>
         <w:rPr>
           <w:rFonts w:ascii="Calibri" w:hAnsi="Calibri"/>
@@ -23538,7 +23538,7 @@
           <w:bottom w:val="single" w:sz="8" w:space="3" w:color="DBEAFE"/>
         </w:pBdr>
       </w:pPr>
-      <w:bookmarkStart w:id="51" w:name="_Toc244455957"/>
+      <w:bookmarkStart w:id="51" w:name="_Toc244457244"/>
       <w:r>
         <w:rPr>
           <w:rFonts w:ascii="Calibri" w:hAnsi="Calibri"/>
@@ -23565,7 +23565,7 @@
           <w:bottom w:val="single" w:sz="8" w:space="3" w:color="DBEAFE"/>
         </w:pBdr>
       </w:pPr>
-      <w:bookmarkStart w:id="52" w:name="_Toc244455958"/>
+      <w:bookmarkStart w:id="52" w:name="_Toc244457245"/>
       <w:r>
         <w:rPr>
           <w:rFonts w:ascii="Calibri" w:hAnsi="Calibri"/>
@@ -23591,7 +23591,7 @@
           <w:bottom w:val="single" w:sz="8" w:space="3" w:color="DBEAFE"/>
         </w:pBdr>
       </w:pPr>
-      <w:bookmarkStart w:id="53" w:name="_Toc244455959"/>
+      <w:bookmarkStart w:id="53" w:name="_Toc244457246"/>
       <w:r>
         <w:rPr>
           <w:rFonts w:ascii="Calibri" w:hAnsi="Calibri"/>
@@ -23617,7 +23617,7 @@
           <w:bottom w:val="single" w:sz="8" w:space="3" w:color="DBEAFE"/>
         </w:pBdr>
       </w:pPr>
-      <w:bookmarkStart w:id="54" w:name="_Toc244455960"/>
+      <w:bookmarkStart w:id="54" w:name="_Toc244457247"/>
       <w:r>
         <w:rPr>
           <w:rFonts w:ascii="Calibri" w:hAnsi="Calibri"/>
@@ -24015,7 +24015,7 @@
         <w:lastRenderedPageBreak/>
         <w:t xml:space="preserve"> </w:t>
       </w:r>
-      <w:bookmarkStart w:id="55" w:name="_Toc244455961"/>
+      <w:bookmarkStart w:id="55" w:name="_Toc244457248"/>
       <w:r>
         <w:rPr>
           <w:rFonts w:ascii="Calibri" w:hAnsi="Calibri"/>
@@ -24919,7 +24919,7 @@
               <w:rPr>
                 <w:sz w:val="16"/>
               </w:rPr>
-              <w:t>« Un livre de 300 pages tient dans l'agent : il cite la page. »</w:t>
+              <w:t>« Un livre de 800 pages tient dans l'agent : il cite la page. »</w:t>
             </w:r>
           </w:p>
         </w:tc>
@@ -25097,7 +25097,7 @@
           <w:bottom w:val="single" w:sz="8" w:space="3" w:color="DBEAFE"/>
         </w:pBdr>
       </w:pPr>
-      <w:bookmarkStart w:id="56" w:name="_Toc244455962"/>
+      <w:bookmarkStart w:id="56" w:name="_Toc244457249"/>
       <w:r>
         <w:rPr>
           <w:rFonts w:ascii="Calibri" w:hAnsi="Calibri"/>
@@ -25137,7 +25137,7 @@
           <w:bottom w:val="single" w:sz="8" w:space="3" w:color="DBEAFE"/>
         </w:pBdr>
       </w:pPr>
-      <w:bookmarkStart w:id="57" w:name="_Toc244455963"/>
+      <w:bookmarkStart w:id="57" w:name="_Toc244457250"/>
       <w:r>
         <w:rPr>
           <w:rFonts w:ascii="Calibri" w:hAnsi="Calibri"/>
@@ -25177,7 +25177,7 @@
           <w:bottom w:val="single" w:sz="8" w:space="3" w:color="DBEAFE"/>
         </w:pBdr>
       </w:pPr>
-      <w:bookmarkStart w:id="58" w:name="_Toc244455964"/>
+      <w:bookmarkStart w:id="58" w:name="_Toc244457251"/>
       <w:r>
         <w:rPr>
           <w:rFonts w:ascii="Calibri" w:hAnsi="Calibri"/>
@@ -25431,7 +25431,7 @@
         <w:lastRenderedPageBreak/>
         <w:t xml:space="preserve"> </w:t>
       </w:r>
-      <w:bookmarkStart w:id="59" w:name="_Toc244455965"/>
+      <w:bookmarkStart w:id="59" w:name="_Toc244457252"/>
       <w:r>
         <w:rPr>
           <w:rFonts w:ascii="Calibri" w:hAnsi="Calibri"/>
@@ -26672,7 +26672,7 @@
         <w:lastRenderedPageBreak/>
         <w:t xml:space="preserve"> </w:t>
       </w:r>
-      <w:bookmarkStart w:id="60" w:name="_Toc244455966"/>
+      <w:bookmarkStart w:id="60" w:name="_Toc244457253"/>
       <w:r>
         <w:rPr>
           <w:rFonts w:ascii="Calibri" w:hAnsi="Calibri"/>
@@ -26700,7 +26700,7 @@
           <w:bottom w:val="single" w:sz="8" w:space="3" w:color="DBEAFE"/>
         </w:pBdr>
       </w:pPr>
-      <w:bookmarkStart w:id="61" w:name="_Toc244455967"/>
+      <w:bookmarkStart w:id="61" w:name="_Toc244457254"/>
       <w:r>
         <w:rPr>
           <w:rFonts w:ascii="Calibri" w:hAnsi="Calibri"/>
@@ -26889,7 +26889,7 @@
           <w:bottom w:val="single" w:sz="8" w:space="3" w:color="DBEAFE"/>
         </w:pBdr>
       </w:pPr>
-      <w:bookmarkStart w:id="62" w:name="_Toc244455968"/>
+      <w:bookmarkStart w:id="62" w:name="_Toc244457255"/>
       <w:r>
         <w:rPr>
           <w:rFonts w:ascii="Calibri" w:hAnsi="Calibri"/>
@@ -28164,7 +28164,7 @@
           <w:bottom w:val="single" w:sz="8" w:space="3" w:color="DBEAFE"/>
         </w:pBdr>
       </w:pPr>
-      <w:bookmarkStart w:id="63" w:name="_Toc244455969"/>
+      <w:bookmarkStart w:id="63" w:name="_Toc244457256"/>
       <w:r>
         <w:rPr>
           <w:rFonts w:ascii="Calibri" w:hAnsi="Calibri"/>
@@ -28918,7 +28918,7 @@
           <w:bottom w:val="single" w:sz="8" w:space="3" w:color="DBEAFE"/>
         </w:pBdr>
       </w:pPr>
-      <w:bookmarkStart w:id="64" w:name="_Toc244455970"/>
+      <w:bookmarkStart w:id="64" w:name="_Toc244457257"/>
       <w:r>
         <w:rPr>
           <w:rFonts w:ascii="Calibri" w:hAnsi="Calibri"/>
@@ -29749,7 +29749,7 @@
           <w:bottom w:val="single" w:sz="8" w:space="3" w:color="DBEAFE"/>
         </w:pBdr>
       </w:pPr>
-      <w:bookmarkStart w:id="65" w:name="_Toc244455971"/>
+      <w:bookmarkStart w:id="65" w:name="_Toc244457258"/>
       <w:r>
         <w:rPr>
           <w:rFonts w:ascii="Calibri" w:hAnsi="Calibri"/>
@@ -29838,7 +29838,7 @@
           <w:bottom w:val="single" w:sz="8" w:space="3" w:color="DBEAFE"/>
         </w:pBdr>
       </w:pPr>
-      <w:bookmarkStart w:id="66" w:name="_Toc244455972"/>
+      <w:bookmarkStart w:id="66" w:name="_Toc244457259"/>
       <w:r>
         <w:rPr>
           <w:rFonts w:ascii="Calibri" w:hAnsi="Calibri"/>
@@ -29922,7 +29922,7 @@
           <w:sz w:val="17"/>
         </w:rPr>
         <w:br/>
-        <w:t>6. Que dit le livre sur useReducer ?          -&gt; RAG livre, p.42 (si livre indexe)</w:t>
+        <w:t>6. Que dit le livre sur Redux ?               -&gt; RAG livre, p.565 (si livre indexe)</w:t>
       </w:r>
       <w:r>
         <w:rPr>
@@ -30298,31 +30298,31 @@
       </w:rPr>
     </w:lvl>
   </w:abstractNum>
-  <w:num w:numId="1" w16cid:durableId="291601332">
+  <w:num w:numId="1" w16cid:durableId="876551455">
     <w:abstractNumId w:val="8"/>
   </w:num>
-  <w:num w:numId="2" w16cid:durableId="1227300661">
+  <w:num w:numId="2" w16cid:durableId="572204078">
     <w:abstractNumId w:val="6"/>
   </w:num>
-  <w:num w:numId="3" w16cid:durableId="226309111">
+  <w:num w:numId="3" w16cid:durableId="1279986931">
     <w:abstractNumId w:val="5"/>
   </w:num>
-  <w:num w:numId="4" w16cid:durableId="229274261">
+  <w:num w:numId="4" w16cid:durableId="773019501">
     <w:abstractNumId w:val="4"/>
   </w:num>
-  <w:num w:numId="5" w16cid:durableId="164250007">
+  <w:num w:numId="5" w16cid:durableId="1134639727">
     <w:abstractNumId w:val="7"/>
   </w:num>
-  <w:num w:numId="6" w16cid:durableId="224874700">
+  <w:num w:numId="6" w16cid:durableId="1310092029">
     <w:abstractNumId w:val="3"/>
   </w:num>
-  <w:num w:numId="7" w16cid:durableId="723479831">
+  <w:num w:numId="7" w16cid:durableId="898786178">
     <w:abstractNumId w:val="2"/>
   </w:num>
-  <w:num w:numId="8" w16cid:durableId="1985424249">
+  <w:num w:numId="8" w16cid:durableId="405735862">
     <w:abstractNumId w:val="1"/>
   </w:num>
-  <w:num w:numId="9" w16cid:durableId="1240091447">
+  <w:num w:numId="9" w16cid:durableId="1175342089">
     <w:abstractNumId w:val="0"/>
   </w:num>
 </w:numbering>
@@ -41727,7 +41727,7 @@
     <w:autoRedefine/>
     <w:uiPriority w:val="39"/>
     <w:unhideWhenUsed/>
-    <w:rsid w:val="00AE061B"/>
+    <w:rsid w:val="00BF1719"/>
   </w:style>
   <w:style w:type="paragraph" w:styleId="TOC2">
     <w:name w:val="toc 2"/>
@@ -41736,7 +41736,7 @@
     <w:autoRedefine/>
     <w:uiPriority w:val="39"/>
     <w:unhideWhenUsed/>
-    <w:rsid w:val="00AE061B"/>
+    <w:rsid w:val="00BF1719"/>
     <w:pPr>
       <w:ind w:left="210"/>
     </w:pPr>
@@ -41746,7 +41746,7 @@
     <w:basedOn w:val="DefaultParagraphFont"/>
     <w:uiPriority w:val="99"/>
     <w:unhideWhenUsed/>
-    <w:rsid w:val="00AE061B"/>
+    <w:rsid w:val="00BF1719"/>
     <w:rPr>
       <w:color w:val="0000FF" w:themeColor="hyperlink"/>
       <w:u w:val="single"/>

</xml_diff>